<commit_message>
[user-manual-ccu-zcu] Bước 0.2: Screen Inventory + checklist screenshot 18 màn hình
- Kiểm kê 18/18 view CcuUI: tên hiển thị, chức năng, mức chi tiết, cách mở từ UI (xác minh code-behind), nhóm chụp 2.1-2.4
- Checklist 79 ảnh (2.1=16, 2.2=28, 2.3=20, 2.4=15 gồm KeyGen + 8 ảnh terminal ZCU) với điều kiện tiên quyết ZCU/SSH/DATA
- Điều chỉnh phân nhóm: ConfirmDeleteDialog + SystemInventoryWindow chụp trong bước 2.2 (chỉ mở được từ FileManager/RemoteScreen)
- Phát hiện: LicenseWindow không có entry point UI (dead code) -> cần harness dev tạm; 5 mục cần quyết định trước Phase 2
- Kịch bản dữ liệu mẫu thống nhất (3 máy P01/P02/P03, kztek-demo) trong _workspace (không commit)

Plan: docs/plans/PLAN-user-manual-ccu-zcu-2026-07-26/steps/STEP-0.2-screen-inventory.md
Co-Authored-By: Claude Opus 5 (1M context) <noreply@anthropic.com>
</commit_message>
<xml_diff>
--- a/docs/plans/PLAN-user-manual-ccu-zcu-2026-07-26/PLAN-MASTER.docx
+++ b/docs/plans/PLAN-user-manual-ccu-zcu-2026-07-26/PLAN-MASTER.docx
@@ -40,7 +40,7 @@
         <w:rPr>
           <w:sz w:val="21"/>
         </w:rPr>
-        <w:t>updated: 2026-07-26</w:t>
+        <w:t>updated: 2026-07-26 16:39</w:t>
       </w:r>
     </w:p>
     <w:p>
@@ -869,7 +869,7 @@
               <w:rPr>
                 <w:sz w:val="20"/>
               </w:rPr>
-              <w:t>⬜</w:t>
+              <w:t>✅</w:t>
             </w:r>
           </w:p>
         </w:tc>
@@ -909,7 +909,7 @@
               <w:rPr>
                 <w:sz w:val="20"/>
               </w:rPr>
-              <w:t>-</w:t>
+              <w:t>2026-07-26 16:39</w:t>
             </w:r>
           </w:p>
         </w:tc>
@@ -3411,13 +3411,82 @@
           <w:b/>
           <w:sz w:val="21"/>
         </w:rPr>
-        <w:t>[USER CHỐT 2026-07-26]</w:t>
+        <w:t>[USER CUNG CẤP 2026-07-26]</w:t>
       </w:r>
       <w:r>
         <w:rPr>
           <w:sz w:val="21"/>
         </w:rPr>
-        <w:t xml:space="preserve"> Sẽ có thiết bị ZCU thật/SSH cho Phase 2 — user cung cấp thông tin kết nối trước khi bắt đầu Phase 2. Dispatcher PHẢI hỏi user IP/tài khoản SSH trước bước 2.1.</w:t>
+        <w:t xml:space="preserve"> Thiết bị ZCU thật cho Phase 2: host </w:t>
+      </w:r>
+      <w:r>
+        <w:rPr>
+          <w:rFonts w:ascii="Courier New" w:hAnsi="Courier New"/>
+          <w:color w:val="F05922"/>
+          <w:sz w:val="21"/>
+        </w:rPr>
+        <w:t>192.168.1.4</w:t>
+      </w:r>
+      <w:r>
+        <w:rPr>
+          <w:sz w:val="21"/>
+        </w:rPr>
+        <w:t xml:space="preserve">, user </w:t>
+      </w:r>
+      <w:r>
+        <w:rPr>
+          <w:rFonts w:ascii="Courier New" w:hAnsi="Courier New"/>
+          <w:color w:val="F05922"/>
+          <w:sz w:val="21"/>
+        </w:rPr>
+        <w:t>kztek</w:t>
+      </w:r>
+      <w:r>
+        <w:rPr>
+          <w:sz w:val="21"/>
+        </w:rPr>
+        <w:t xml:space="preserve">. </w:t>
+      </w:r>
+      <w:r>
+        <w:rPr>
+          <w:b/>
+          <w:sz w:val="21"/>
+        </w:rPr>
+        <w:t>Credential đầy đủ (kèm mật khẩu) lưu tại `temp/user-manual-ccu-zcu/zcu-connection.md` — thư mục `temp/` đã gitignore, TUYỆT ĐỐI KHÔNG chép mật khẩu vào bất kỳ file nào dưới `docs/` hoặc `_workspace/`.</w:t>
+      </w:r>
+      <w:r>
+        <w:rPr>
+          <w:sz w:val="21"/>
+        </w:rPr>
+        <w:t xml:space="preserve"> Trong MANUAL phải dùng giá trị ví dụ giả (</w:t>
+      </w:r>
+      <w:r>
+        <w:rPr>
+          <w:rFonts w:ascii="Courier New" w:hAnsi="Courier New"/>
+          <w:color w:val="F05922"/>
+          <w:sz w:val="21"/>
+        </w:rPr>
+        <w:t>192.168.1.x</w:t>
+      </w:r>
+      <w:r>
+        <w:rPr>
+          <w:sz w:val="21"/>
+        </w:rPr>
+        <w:t xml:space="preserve">, </w:t>
+      </w:r>
+      <w:r>
+        <w:rPr>
+          <w:rFonts w:ascii="Courier New" w:hAnsi="Courier New"/>
+          <w:color w:val="F05922"/>
+          <w:sz w:val="21"/>
+        </w:rPr>
+        <w:t>&lt;user&gt;</w:t>
+      </w:r>
+      <w:r>
+        <w:rPr>
+          <w:sz w:val="21"/>
+        </w:rPr>
+        <w:t>), không ghi credential thật.</w:t>
       </w:r>
     </w:p>
     <w:p>
@@ -3821,6 +3890,79 @@
           </w:p>
         </w:tc>
       </w:tr>
+      <w:tr>
+        <w:tc>
+          <w:tcPr>
+            <w:tcW w:type="dxa" w:w="3230"/>
+            <w:tcBorders>
+              <w:top w:val="single" w:sz="4" w:space="0" w:color="CBCBCB"/>
+              <w:left w:val="single" w:sz="4" w:space="0" w:color="CBCBCB"/>
+              <w:bottom w:val="single" w:sz="4" w:space="0" w:color="CBCBCB"/>
+              <w:right w:val="single" w:sz="4" w:space="0" w:color="CBCBCB"/>
+            </w:tcBorders>
+          </w:tcPr>
+          <w:p>
+            <w:r>
+              <w:rPr>
+                <w:sz w:val="20"/>
+              </w:rPr>
+              <w:t>2026-07-26</w:t>
+            </w:r>
+          </w:p>
+        </w:tc>
+        <w:tc>
+          <w:tcPr>
+            <w:tcW w:type="dxa" w:w="3230"/>
+            <w:tcBorders>
+              <w:top w:val="single" w:sz="4" w:space="0" w:color="CBCBCB"/>
+              <w:left w:val="single" w:sz="4" w:space="0" w:color="CBCBCB"/>
+              <w:bottom w:val="single" w:sz="4" w:space="0" w:color="CBCBCB"/>
+              <w:right w:val="single" w:sz="4" w:space="0" w:color="CBCBCB"/>
+            </w:tcBorders>
+          </w:tcPr>
+          <w:p>
+            <w:r>
+              <w:rPr>
+                <w:sz w:val="20"/>
+              </w:rPr>
+              <w:t xml:space="preserve">Bước 0.2 ✅ — Screen Inventory 18/18 view + checklist 79 ảnh (2.1=16, 2.2=28, 2.3=20, 2.4=15) tại </w:t>
+            </w:r>
+            <w:r>
+              <w:rPr>
+                <w:rFonts w:ascii="Courier New" w:hAnsi="Courier New"/>
+                <w:color w:val="F05922"/>
+                <w:sz w:val="20"/>
+              </w:rPr>
+              <w:t>_workspace/00_docwriter_screen-inventory.md</w:t>
+            </w:r>
+            <w:r>
+              <w:rPr>
+                <w:sz w:val="20"/>
+              </w:rPr>
+              <w:t>; điều chỉnh: ConfirmDeleteDialog + SystemInventoryWindow chụp trong bước 2.2; LicenseWindow không có entry point UI → cần harness dev tạm; 5 mục cần quyết định trước Phase 2 (mục 4 inventory)</w:t>
+            </w:r>
+          </w:p>
+        </w:tc>
+        <w:tc>
+          <w:tcPr>
+            <w:tcW w:type="dxa" w:w="3230"/>
+            <w:tcBorders>
+              <w:top w:val="single" w:sz="4" w:space="0" w:color="CBCBCB"/>
+              <w:left w:val="single" w:sz="4" w:space="0" w:color="CBCBCB"/>
+              <w:bottom w:val="single" w:sz="4" w:space="0" w:color="CBCBCB"/>
+              <w:right w:val="single" w:sz="4" w:space="0" w:color="CBCBCB"/>
+            </w:tcBorders>
+          </w:tcPr>
+          <w:p>
+            <w:r>
+              <w:rPr>
+                <w:sz w:val="20"/>
+              </w:rPr>
+              <w:t>documentation-writer</w:t>
+            </w:r>
+          </w:p>
+        </w:tc>
+      </w:tr>
     </w:tbl>
     <w:p/>
     <w:p>

</xml_diff>

<commit_message>
[user-manual-ccu-zcu] Bước 1.1: Build Release CcuUI + xác nhận app chạy, kiểm chứng cơ chế chụp ảnh
- Build Release IPGS.RemoteControl.CcuUI: Build succeeded 0 error (exe bin/Release/net8.0, ProductVersion 1.0.0+2888754)
- App khởi động thật từ exe Release, PID 17180, ConnectionEntryWindow hiển thị bình thường — để nguyên chạy cho Phase 2
- Script chụp temp/user-manual-ccu-zcu/capture-window.ps1 dùng PrintWindow(PW_RENDERFULLCONTENT) — chụp theo window handle, không bị cửa sổ khác che (CopyFromScreen bị che ở lần thử đầu)
- Ảnh kiểm chứng thật docs/user-manuals/screenshots/connection-entry-default.png (1216x799)

Plan: docs/plans/PLAN-user-manual-ccu-zcu-2026-07-26/steps/STEP-1.1-build-run-ccuui.md
Co-Authored-By: Claude Opus 5 (1M context) <noreply@anthropic.com>
</commit_message>
<xml_diff>
--- a/docs/plans/PLAN-user-manual-ccu-zcu-2026-07-26/PLAN-MASTER.docx
+++ b/docs/plans/PLAN-user-manual-ccu-zcu-2026-07-26/PLAN-MASTER.docx
@@ -40,7 +40,7 @@
         <w:rPr>
           <w:sz w:val="21"/>
         </w:rPr>
-        <w:t>updated: 2026-07-26 16:39</w:t>
+        <w:t>updated: 2026-07-26 16:44</w:t>
       </w:r>
     </w:p>
     <w:p>
@@ -1284,7 +1284,7 @@
               <w:rPr>
                 <w:sz w:val="20"/>
               </w:rPr>
-              <w:t>⬜</w:t>
+              <w:t>✅</w:t>
             </w:r>
           </w:p>
         </w:tc>
@@ -1326,7 +1326,7 @@
               <w:rPr>
                 <w:sz w:val="20"/>
               </w:rPr>
-              <w:t>-</w:t>
+              <w:t>2026-07-26 16:44</w:t>
             </w:r>
           </w:p>
         </w:tc>
@@ -3963,6 +3963,96 @@
           </w:p>
         </w:tc>
       </w:tr>
+      <w:tr>
+        <w:tc>
+          <w:tcPr>
+            <w:tcW w:type="dxa" w:w="3230"/>
+            <w:shd w:val="clear" w:color="auto" w:fill="B8B3D6"/>
+            <w:tcBorders>
+              <w:top w:val="single" w:sz="4" w:space="0" w:color="CBCBCB"/>
+              <w:left w:val="single" w:sz="4" w:space="0" w:color="CBCBCB"/>
+              <w:bottom w:val="single" w:sz="4" w:space="0" w:color="CBCBCB"/>
+              <w:right w:val="single" w:sz="4" w:space="0" w:color="CBCBCB"/>
+            </w:tcBorders>
+          </w:tcPr>
+          <w:p>
+            <w:r>
+              <w:rPr>
+                <w:sz w:val="20"/>
+              </w:rPr>
+              <w:t>2026-07-26</w:t>
+            </w:r>
+          </w:p>
+        </w:tc>
+        <w:tc>
+          <w:tcPr>
+            <w:tcW w:type="dxa" w:w="3230"/>
+            <w:shd w:val="clear" w:color="auto" w:fill="B8B3D6"/>
+            <w:tcBorders>
+              <w:top w:val="single" w:sz="4" w:space="0" w:color="CBCBCB"/>
+              <w:left w:val="single" w:sz="4" w:space="0" w:color="CBCBCB"/>
+              <w:bottom w:val="single" w:sz="4" w:space="0" w:color="CBCBCB"/>
+              <w:right w:val="single" w:sz="4" w:space="0" w:color="CBCBCB"/>
+            </w:tcBorders>
+          </w:tcPr>
+          <w:p>
+            <w:r>
+              <w:rPr>
+                <w:sz w:val="20"/>
+              </w:rPr>
+              <w:t xml:space="preserve">Bước 1.1 ✅ — Build Release CcuUI 0 error; app chạy thật từ exe Release (PID 17180, để nguyên cho Phase 2); script chụp </w:t>
+            </w:r>
+            <w:r>
+              <w:rPr>
+                <w:rFonts w:ascii="Courier New" w:hAnsi="Courier New"/>
+                <w:color w:val="F05922"/>
+                <w:sz w:val="20"/>
+              </w:rPr>
+              <w:t>temp/user-manual-ccu-zcu/capture-window.ps1</w:t>
+            </w:r>
+            <w:r>
+              <w:rPr>
+                <w:sz w:val="20"/>
+              </w:rPr>
+              <w:t xml:space="preserve"> (PrintWindow + PW_RENDERFULLCONTENT — không bị cửa sổ khác che); kiểm chứng bằng ảnh thật </w:t>
+            </w:r>
+            <w:r>
+              <w:rPr>
+                <w:rFonts w:ascii="Courier New" w:hAnsi="Courier New"/>
+                <w:color w:val="F05922"/>
+                <w:sz w:val="20"/>
+              </w:rPr>
+              <w:t>screenshots/connection-entry-default.png</w:t>
+            </w:r>
+            <w:r>
+              <w:rPr>
+                <w:sz w:val="20"/>
+              </w:rPr>
+              <w:t xml:space="preserve"> (1216×799)</w:t>
+            </w:r>
+          </w:p>
+        </w:tc>
+        <w:tc>
+          <w:tcPr>
+            <w:tcW w:type="dxa" w:w="3230"/>
+            <w:shd w:val="clear" w:color="auto" w:fill="B8B3D6"/>
+            <w:tcBorders>
+              <w:top w:val="single" w:sz="4" w:space="0" w:color="CBCBCB"/>
+              <w:left w:val="single" w:sz="4" w:space="0" w:color="CBCBCB"/>
+              <w:bottom w:val="single" w:sz="4" w:space="0" w:color="CBCBCB"/>
+              <w:right w:val="single" w:sz="4" w:space="0" w:color="CBCBCB"/>
+            </w:tcBorders>
+          </w:tcPr>
+          <w:p>
+            <w:r>
+              <w:rPr>
+                <w:sz w:val="20"/>
+              </w:rPr>
+              <w:t>documentation-writer</w:t>
+            </w:r>
+          </w:p>
+        </w:tc>
+      </w:tr>
     </w:tbl>
     <w:p/>
     <w:p>

</xml_diff>

<commit_message>
[user-manual-ccu-zcu] Bước 2.1: Chụp screenshot nhóm Kết nối & Quản lý thiết bị
- 15/16 ảnh: ConnectionEntry 9/9, ComputerEdit 3/3, NetworkScan 2/3, SessionPicker 1/1 — chụp từ app Release thật qua UIA + PrintWindow, verify từng ảnh
- Thiếu network-scan-results (ZCU 192.168.1.4 không mở cổng 22/17600); connection-entry-default chụp bản P01-offline, chụp lại ở bước 2.2 khi ZCU online
- Token/MAC/mật khẩu đều dùng giá trị demo hoặc đã che trong ảnh; dữ liệu mẫu P01/P02/P03 giữ trong store cho bước 2.2-2.4, backup store thật tại temp/ (khôi phục ở 4.1)

Plan: docs/plans/PLAN-user-manual-ccu-zcu-2026-07-26/steps/STEP-2.1-shots-connection.md
Co-Authored-By: Claude Opus 5 (1M context) <noreply@anthropic.com>
</commit_message>
<xml_diff>
--- a/docs/plans/PLAN-user-manual-ccu-zcu-2026-07-26/PLAN-MASTER.docx
+++ b/docs/plans/PLAN-user-manual-ccu-zcu-2026-07-26/PLAN-MASTER.docx
@@ -40,7 +40,7 @@
         <w:rPr>
           <w:sz w:val="21"/>
         </w:rPr>
-        <w:t>updated: 2026-07-26 16:44</w:t>
+        <w:t>updated: 2026-07-26 17:28</w:t>
       </w:r>
     </w:p>
     <w:p>
@@ -1687,7 +1687,7 @@
               <w:rPr>
                 <w:sz w:val="20"/>
               </w:rPr>
-              <w:t>⬜</w:t>
+              <w:t>✅</w:t>
             </w:r>
           </w:p>
         </w:tc>
@@ -1729,7 +1729,7 @@
               <w:rPr>
                 <w:sz w:val="20"/>
               </w:rPr>
-              <w:t>-</w:t>
+              <w:t>2026-07-26 17:28</w:t>
             </w:r>
           </w:p>
         </w:tc>
@@ -3497,6 +3497,220 @@
       </w:pPr>
       <w:r>
         <w:rPr>
+          <w:b/>
+          <w:sz w:val="21"/>
+        </w:rPr>
+        <w:t>[USER CHỐT 2026-07-26 — Phase 2, trả lời 5 mục cần quyết ở `_workspace/00_docwriter_screen-inventory.md` §4]</w:t>
+      </w:r>
+    </w:p>
+    <w:p>
+      <w:pPr>
+        <w:pStyle w:val="ListBullet"/>
+        <w:spacing w:after="20"/>
+        <w:ind w:left="567"/>
+      </w:pPr>
+      <w:r>
+        <w:rPr>
+          <w:sz w:val="21"/>
+        </w:rPr>
+        <w:t xml:space="preserve">✅ </w:t>
+      </w:r>
+      <w:r>
+        <w:rPr>
+          <w:b/>
+          <w:sz w:val="21"/>
+        </w:rPr>
+        <w:t>ĐƯỢC PHÉP</w:t>
+      </w:r>
+      <w:r>
+        <w:rPr>
+          <w:sz w:val="21"/>
+        </w:rPr>
+        <w:t xml:space="preserve"> chạy thật ZcuSetupWizard cài/cập nhật ZcuAgent lên </w:t>
+      </w:r>
+      <w:r>
+        <w:rPr>
+          <w:rFonts w:ascii="Courier New" w:hAnsi="Courier New"/>
+          <w:color w:val="F05922"/>
+          <w:sz w:val="21"/>
+        </w:rPr>
+        <w:t>192.168.1.4</w:t>
+      </w:r>
+      <w:r>
+        <w:rPr>
+          <w:sz w:val="21"/>
+        </w:rPr>
+        <w:t xml:space="preserve"> (giữ nguyên Token/Port hiện tại, chấp nhận restart agent) → chụp </w:t>
+      </w:r>
+      <w:r>
+        <w:rPr>
+          <w:rFonts w:ascii="Courier New" w:hAnsi="Courier New"/>
+          <w:color w:val="F05922"/>
+          <w:sz w:val="21"/>
+        </w:rPr>
+        <w:t>zcu-setup-wizard-installing/success</w:t>
+      </w:r>
+      <w:r>
+        <w:rPr>
+          <w:sz w:val="21"/>
+        </w:rPr>
+        <w:t xml:space="preserve">, </w:t>
+      </w:r>
+      <w:r>
+        <w:rPr>
+          <w:rFonts w:ascii="Courier New" w:hAnsi="Courier New"/>
+          <w:color w:val="F05922"/>
+          <w:sz w:val="21"/>
+        </w:rPr>
+        <w:t>zcu-terminal-*</w:t>
+      </w:r>
+      <w:r>
+        <w:rPr>
+          <w:sz w:val="21"/>
+        </w:rPr>
+        <w:t>.</w:t>
+      </w:r>
+    </w:p>
+    <w:p>
+      <w:pPr>
+        <w:pStyle w:val="ListBullet"/>
+        <w:spacing w:after="20"/>
+        <w:ind w:left="567"/>
+      </w:pPr>
+      <w:r>
+        <w:rPr>
+          <w:sz w:val="21"/>
+        </w:rPr>
+        <w:t xml:space="preserve">🛑 </w:t>
+      </w:r>
+      <w:r>
+        <w:rPr>
+          <w:b/>
+          <w:sz w:val="21"/>
+        </w:rPr>
+        <w:t>KHÔNG được phép</w:t>
+      </w:r>
+      <w:r>
+        <w:rPr>
+          <w:sz w:val="21"/>
+        </w:rPr>
+        <w:t xml:space="preserve"> bấm Deploy thật ở KioskDeployWindow (đổi GNOME/autologin) → </w:t>
+      </w:r>
+      <w:r>
+        <w:rPr>
+          <w:rFonts w:ascii="Courier New" w:hAnsi="Courier New"/>
+          <w:color w:val="F05922"/>
+          <w:sz w:val="21"/>
+        </w:rPr>
+        <w:t>kiosk-deploy-log.png</w:t>
+      </w:r>
+      <w:r>
+        <w:rPr>
+          <w:sz w:val="21"/>
+        </w:rPr>
+        <w:t xml:space="preserve"> = BLOCK, mô tả bằng chữ.</w:t>
+      </w:r>
+    </w:p>
+    <w:p>
+      <w:pPr>
+        <w:pStyle w:val="ListBullet"/>
+        <w:spacing w:after="20"/>
+        <w:ind w:left="567"/>
+      </w:pPr>
+      <w:r>
+        <w:rPr>
+          <w:sz w:val="21"/>
+        </w:rPr>
+        <w:t xml:space="preserve">🛑 </w:t>
+      </w:r>
+      <w:r>
+        <w:rPr>
+          <w:b/>
+          <w:sz w:val="21"/>
+        </w:rPr>
+        <w:t>KHÔNG được phép</w:t>
+      </w:r>
+      <w:r>
+        <w:rPr>
+          <w:sz w:val="21"/>
+        </w:rPr>
+        <w:t xml:space="preserve"> cài gói .deb thử qua RemoteAppInstall → ảnh trạng thái "cài thành công" = BLOCK, chỉ chụp tới bước chọn gói/xác nhận.</w:t>
+      </w:r>
+    </w:p>
+    <w:p>
+      <w:pPr>
+        <w:pStyle w:val="ListBullet"/>
+        <w:spacing w:after="20"/>
+        <w:ind w:left="567"/>
+      </w:pPr>
+      <w:r>
+        <w:rPr>
+          <w:sz w:val="21"/>
+        </w:rPr>
+        <w:t xml:space="preserve">✅ </w:t>
+      </w:r>
+      <w:r>
+        <w:rPr>
+          <w:b/>
+          <w:sz w:val="21"/>
+        </w:rPr>
+        <w:t>LicenseWindow:</w:t>
+      </w:r>
+      <w:r>
+        <w:rPr>
+          <w:sz w:val="21"/>
+        </w:rPr>
+        <w:t xml:space="preserve"> mở bằng </w:t>
+      </w:r>
+      <w:r>
+        <w:rPr>
+          <w:b/>
+          <w:sz w:val="21"/>
+        </w:rPr>
+        <w:t>harness tạm trong `temp/`</w:t>
+      </w:r>
+      <w:r>
+        <w:rPr>
+          <w:sz w:val="21"/>
+        </w:rPr>
+        <w:t xml:space="preserve"> (project console nhỏ, KHÔNG commit, </w:t>
+      </w:r>
+      <w:r>
+        <w:rPr>
+          <w:b/>
+          <w:sz w:val="21"/>
+        </w:rPr>
+        <w:t>KHÔNG sửa code sản phẩm</w:t>
+      </w:r>
+      <w:r>
+        <w:rPr>
+          <w:sz w:val="21"/>
+        </w:rPr>
+        <w:t xml:space="preserve">) để chụp ảnh thật. </w:t>
+      </w:r>
+      <w:r>
+        <w:rPr>
+          <w:rFonts w:ascii="Courier New" w:hAnsi="Courier New"/>
+          <w:color w:val="F05922"/>
+          <w:sz w:val="21"/>
+        </w:rPr>
+        <w:t>license-success</w:t>
+      </w:r>
+      <w:r>
+        <w:rPr>
+          <w:sz w:val="21"/>
+        </w:rPr>
+        <w:t xml:space="preserve"> vẫn BLOCK nếu không sinh được key hợp lệ.</w:t>
+      </w:r>
+    </w:p>
+    <w:p>
+      <w:pPr>
+        <w:pStyle w:val="ListBullet"/>
+        <w:spacing w:after="20"/>
+        <w:ind w:left="283"/>
+      </w:pPr>
+      <w:r>
+        <w:rPr>
           <w:sz w:val="21"/>
         </w:rPr>
         <w:t>Phạm vi + screenshot từ app thật đã được user chốt trước khi tạo plan — không hỏi lại.</w:t>
@@ -4053,6 +4267,107 @@
           </w:p>
         </w:tc>
       </w:tr>
+      <w:tr>
+        <w:tc>
+          <w:tcPr>
+            <w:tcW w:type="dxa" w:w="3230"/>
+            <w:tcBorders>
+              <w:top w:val="single" w:sz="4" w:space="0" w:color="CBCBCB"/>
+              <w:left w:val="single" w:sz="4" w:space="0" w:color="CBCBCB"/>
+              <w:bottom w:val="single" w:sz="4" w:space="0" w:color="CBCBCB"/>
+              <w:right w:val="single" w:sz="4" w:space="0" w:color="CBCBCB"/>
+            </w:tcBorders>
+          </w:tcPr>
+          <w:p>
+            <w:r>
+              <w:rPr>
+                <w:sz w:val="20"/>
+              </w:rPr>
+              <w:t>2026-07-26</w:t>
+            </w:r>
+          </w:p>
+        </w:tc>
+        <w:tc>
+          <w:tcPr>
+            <w:tcW w:type="dxa" w:w="3230"/>
+            <w:tcBorders>
+              <w:top w:val="single" w:sz="4" w:space="0" w:color="CBCBCB"/>
+              <w:left w:val="single" w:sz="4" w:space="0" w:color="CBCBCB"/>
+              <w:bottom w:val="single" w:sz="4" w:space="0" w:color="CBCBCB"/>
+              <w:right w:val="single" w:sz="4" w:space="0" w:color="CBCBCB"/>
+            </w:tcBorders>
+          </w:tcPr>
+          <w:p>
+            <w:r>
+              <w:rPr>
+                <w:sz w:val="20"/>
+              </w:rPr>
+              <w:t xml:space="preserve">Bước 2.1 ✅ — 15/16 ảnh nhóm Kết nối &amp; Quản lý thiết bị (verify từng ảnh bằng Read); 🛑 thiếu </w:t>
+            </w:r>
+            <w:r>
+              <w:rPr>
+                <w:rFonts w:ascii="Courier New" w:hAnsi="Courier New"/>
+                <w:color w:val="F05922"/>
+                <w:sz w:val="20"/>
+              </w:rPr>
+              <w:t>network-scan-results</w:t>
+            </w:r>
+            <w:r>
+              <w:rPr>
+                <w:sz w:val="20"/>
+              </w:rPr>
+              <w:t xml:space="preserve"> + ⚠️ </w:t>
+            </w:r>
+            <w:r>
+              <w:rPr>
+                <w:rFonts w:ascii="Courier New" w:hAnsi="Courier New"/>
+                <w:color w:val="F05922"/>
+                <w:sz w:val="20"/>
+              </w:rPr>
+              <w:t>connection-entry-default</w:t>
+            </w:r>
+            <w:r>
+              <w:rPr>
+                <w:sz w:val="20"/>
+              </w:rPr>
+              <w:t xml:space="preserve"> chụp bản P01-offline (ZCU 192.168.1.4 không mở cổng 22/17600 — cần user kiểm tra thiết bị trước bước 2.2); dữ liệu mẫu P01/P02/P03 giữ trong store, backup store thật tại </w:t>
+            </w:r>
+            <w:r>
+              <w:rPr>
+                <w:rFonts w:ascii="Courier New" w:hAnsi="Courier New"/>
+                <w:color w:val="F05922"/>
+                <w:sz w:val="20"/>
+              </w:rPr>
+              <w:t>temp/user-manual-ccu-zcu/profiles.backup.json</w:t>
+            </w:r>
+            <w:r>
+              <w:rPr>
+                <w:sz w:val="20"/>
+              </w:rPr>
+              <w:t xml:space="preserve"> (khôi phục ở 4.1)</w:t>
+            </w:r>
+          </w:p>
+        </w:tc>
+        <w:tc>
+          <w:tcPr>
+            <w:tcW w:type="dxa" w:w="3230"/>
+            <w:tcBorders>
+              <w:top w:val="single" w:sz="4" w:space="0" w:color="CBCBCB"/>
+              <w:left w:val="single" w:sz="4" w:space="0" w:color="CBCBCB"/>
+              <w:bottom w:val="single" w:sz="4" w:space="0" w:color="CBCBCB"/>
+              <w:right w:val="single" w:sz="4" w:space="0" w:color="CBCBCB"/>
+            </w:tcBorders>
+          </w:tcPr>
+          <w:p>
+            <w:r>
+              <w:rPr>
+                <w:sz w:val="20"/>
+              </w:rPr>
+              <w:t>documentation-writer</w:t>
+            </w:r>
+          </w:p>
+        </w:tc>
+      </w:tr>
     </w:tbl>
     <w:p/>
     <w:p>

</xml_diff>

<commit_message>
[user-manual-ccu-zcu] Bước 2.2: Chụp screenshot nhóm Remote & Điều khiển (BLOCKED — ZCU offline)
- ZCU 192.168.1.4 vẫn offline dù user báo đã bật VM: ping fail ~6 phút, cổng 22/17600 đóng, quét cả subnet không thấy — nghi VM ở chế độ NAT thay vì Bridged
- Chụp được 4/28 ảnh không cần ZCU (verify từng ảnh bằng Read): remote-screen-connecting, remote-screen-ssh-help, remote-screen-faulted, multi-remote-empty
- 24 ảnh còn lại + 2 ảnh bù 2.1 + dữ liệu demo SSH: BLOCK chờ ZCU online, không bịa ảnh
- Cập nhật STEP-2.2 (status: blocked) + PLAN-MASTER (dòng 2.2 → 🛑, mục Blockers, lịch sử)

Plan: docs/plans/PLAN-user-manual-ccu-zcu-2026-07-26/steps/STEP-2.2-shots-remote.md
Co-Authored-By: Claude Opus 5 (1M context) <noreply@anthropic.com>
</commit_message>
<xml_diff>
--- a/docs/plans/PLAN-user-manual-ccu-zcu-2026-07-26/PLAN-MASTER.docx
+++ b/docs/plans/PLAN-user-manual-ccu-zcu-2026-07-26/PLAN-MASTER.docx
@@ -40,7 +40,7 @@
         <w:rPr>
           <w:sz w:val="21"/>
         </w:rPr>
-        <w:t>updated: 2026-07-26 17:28</w:t>
+        <w:t>updated: 2026-07-26 17:52</w:t>
       </w:r>
     </w:p>
     <w:p>
@@ -1807,7 +1807,7 @@
               <w:rPr>
                 <w:sz w:val="20"/>
               </w:rPr>
-              <w:t>⬜</w:t>
+              <w:t>🛑</w:t>
             </w:r>
           </w:p>
         </w:tc>
@@ -1847,7 +1847,7 @@
               <w:rPr>
                 <w:sz w:val="20"/>
               </w:rPr>
-              <w:t>-</w:t>
+              <w:t>- (4/28 ảnh — chờ ZCU online)</w:t>
             </w:r>
           </w:p>
         </w:tc>
@@ -2373,6 +2373,352 @@
           </w:p>
         </w:tc>
       </w:tr>
+    </w:tbl>
+    <w:p/>
+    <w:p>
+      <w:pPr>
+        <w:spacing w:before="40" w:after="40"/>
+        <w:ind w:left="567"/>
+        <w:pBdr>
+          <w:left w:val="single" w:sz="12" w:space="10" w:color="F05922"/>
+        </w:pBdr>
+      </w:pPr>
+      <w:r>
+        <w:rPr>
+          <w:color w:val="4A3F8C"/>
+        </w:rPr>
+        <w:t xml:space="preserve">⚠️ </w:t>
+      </w:r>
+      <w:r>
+        <w:rPr>
+          <w:b/>
+          <w:color w:val="4A3F8C"/>
+        </w:rPr>
+        <w:t>[USER CHỐT 2026-07-26] ĐỔI THỨ TỰ:</w:t>
+      </w:r>
+      <w:r>
+        <w:rPr>
+          <w:color w:val="4A3F8C"/>
+        </w:rPr>
+        <w:t xml:space="preserve"> viết phần </w:t>
+      </w:r>
+      <w:r>
+        <w:rPr>
+          <w:b/>
+          <w:color w:val="4A3F8C"/>
+        </w:rPr>
+        <w:t>CCU TRƯỚC</w:t>
+      </w:r>
+      <w:r>
+        <w:rPr>
+          <w:color w:val="4A3F8C"/>
+        </w:rPr>
+        <w:t xml:space="preserve">, ZCU sau. Trong MANUAL: </w:t>
+      </w:r>
+      <w:r>
+        <w:rPr>
+          <w:b/>
+          <w:color w:val="4A3F8C"/>
+        </w:rPr>
+        <w:t>Phần 1 = CCU (thao tác app)</w:t>
+      </w:r>
+      <w:r>
+        <w:rPr>
+          <w:color w:val="4A3F8C"/>
+        </w:rPr>
+        <w:t xml:space="preserve">, </w:t>
+      </w:r>
+      <w:r>
+        <w:rPr>
+          <w:b/>
+          <w:color w:val="4A3F8C"/>
+        </w:rPr>
+        <w:t>Phần 2 = ZCU (triển khai)</w:t>
+      </w:r>
+      <w:r>
+        <w:rPr>
+          <w:color w:val="4A3F8C"/>
+        </w:rPr>
+        <w:t xml:space="preserve"> — ngược với dự kiến ban đầu của plan/scope doc. Bước </w:t>
+      </w:r>
+      <w:r>
+        <w:rPr>
+          <w:b/>
+          <w:color w:val="4A3F8C"/>
+        </w:rPr>
+        <w:t>3.2 chạy TRƯỚC 3.1</w:t>
+      </w:r>
+      <w:r>
+        <w:rPr>
+          <w:color w:val="4A3F8C"/>
+        </w:rPr>
+        <w:t>.</w:t>
+      </w:r>
+    </w:p>
+    <w:tbl>
+      <w:tblPr>
+        <w:tblStyle w:val="TableGrid"/>
+        <w:tblW w:type="auto" w:w="0"/>
+        <w:tblLook w:firstColumn="1" w:firstRow="1" w:lastColumn="0" w:lastRow="0" w:noHBand="0" w:noVBand="1" w:val="04A0"/>
+      </w:tblPr>
+      <w:tblGrid>
+        <w:gridCol w:w="1615"/>
+        <w:gridCol w:w="1615"/>
+        <w:gridCol w:w="1615"/>
+        <w:gridCol w:w="1615"/>
+        <w:gridCol w:w="1615"/>
+        <w:gridCol w:w="1615"/>
+      </w:tblGrid>
+      <w:tr>
+        <w:tc>
+          <w:tcPr>
+            <w:tcW w:type="dxa" w:w="1615"/>
+            <w:shd w:val="clear" w:color="auto" w:fill="251C53"/>
+            <w:tcBorders>
+              <w:top w:val="single" w:sz="4" w:space="0" w:color="251C53"/>
+              <w:left w:val="single" w:sz="4" w:space="0" w:color="251C53"/>
+              <w:bottom w:val="single" w:sz="4" w:space="0" w:color="251C53"/>
+              <w:right w:val="single" w:sz="4" w:space="0" w:color="251C53"/>
+            </w:tcBorders>
+          </w:tcPr>
+          <w:p>
+            <w:r>
+              <w:rPr>
+                <w:b/>
+                <w:color w:val="FFFFFF"/>
+                <w:sz w:val="20"/>
+              </w:rPr>
+              <w:t>#</w:t>
+            </w:r>
+          </w:p>
+        </w:tc>
+        <w:tc>
+          <w:tcPr>
+            <w:tcW w:type="dxa" w:w="1615"/>
+            <w:shd w:val="clear" w:color="auto" w:fill="251C53"/>
+            <w:tcBorders>
+              <w:top w:val="single" w:sz="4" w:space="0" w:color="251C53"/>
+              <w:left w:val="single" w:sz="4" w:space="0" w:color="251C53"/>
+              <w:bottom w:val="single" w:sz="4" w:space="0" w:color="251C53"/>
+              <w:right w:val="single" w:sz="4" w:space="0" w:color="251C53"/>
+            </w:tcBorders>
+          </w:tcPr>
+          <w:p>
+            <w:r>
+              <w:rPr>
+                <w:b/>
+                <w:color w:val="FFFFFF"/>
+                <w:sz w:val="20"/>
+              </w:rPr>
+              <w:t>Bước</w:t>
+            </w:r>
+          </w:p>
+        </w:tc>
+        <w:tc>
+          <w:tcPr>
+            <w:tcW w:type="dxa" w:w="1615"/>
+            <w:shd w:val="clear" w:color="auto" w:fill="251C53"/>
+            <w:tcBorders>
+              <w:top w:val="single" w:sz="4" w:space="0" w:color="251C53"/>
+              <w:left w:val="single" w:sz="4" w:space="0" w:color="251C53"/>
+              <w:bottom w:val="single" w:sz="4" w:space="0" w:color="251C53"/>
+              <w:right w:val="single" w:sz="4" w:space="0" w:color="251C53"/>
+            </w:tcBorders>
+          </w:tcPr>
+          <w:p>
+            <w:r>
+              <w:rPr>
+                <w:b/>
+                <w:color w:val="FFFFFF"/>
+                <w:sz w:val="20"/>
+              </w:rPr>
+              <w:t>Agent</w:t>
+            </w:r>
+          </w:p>
+        </w:tc>
+        <w:tc>
+          <w:tcPr>
+            <w:tcW w:type="dxa" w:w="1615"/>
+            <w:shd w:val="clear" w:color="auto" w:fill="251C53"/>
+            <w:tcBorders>
+              <w:top w:val="single" w:sz="4" w:space="0" w:color="251C53"/>
+              <w:left w:val="single" w:sz="4" w:space="0" w:color="251C53"/>
+              <w:bottom w:val="single" w:sz="4" w:space="0" w:color="251C53"/>
+              <w:right w:val="single" w:sz="4" w:space="0" w:color="251C53"/>
+            </w:tcBorders>
+          </w:tcPr>
+          <w:p>
+            <w:r>
+              <w:rPr>
+                <w:b/>
+                <w:color w:val="FFFFFF"/>
+                <w:sz w:val="20"/>
+              </w:rPr>
+              <w:t>Status</w:t>
+            </w:r>
+          </w:p>
+        </w:tc>
+        <w:tc>
+          <w:tcPr>
+            <w:tcW w:type="dxa" w:w="1615"/>
+            <w:shd w:val="clear" w:color="auto" w:fill="251C53"/>
+            <w:tcBorders>
+              <w:top w:val="single" w:sz="4" w:space="0" w:color="251C53"/>
+              <w:left w:val="single" w:sz="4" w:space="0" w:color="251C53"/>
+              <w:bottom w:val="single" w:sz="4" w:space="0" w:color="251C53"/>
+              <w:right w:val="single" w:sz="4" w:space="0" w:color="251C53"/>
+            </w:tcBorders>
+          </w:tcPr>
+          <w:p>
+            <w:r>
+              <w:rPr>
+                <w:b/>
+                <w:color w:val="FFFFFF"/>
+                <w:sz w:val="20"/>
+              </w:rPr>
+              <w:t>Step file</w:t>
+            </w:r>
+          </w:p>
+        </w:tc>
+        <w:tc>
+          <w:tcPr>
+            <w:tcW w:type="dxa" w:w="1615"/>
+            <w:shd w:val="clear" w:color="auto" w:fill="251C53"/>
+            <w:tcBorders>
+              <w:top w:val="single" w:sz="4" w:space="0" w:color="251C53"/>
+              <w:left w:val="single" w:sz="4" w:space="0" w:color="251C53"/>
+              <w:bottom w:val="single" w:sz="4" w:space="0" w:color="251C53"/>
+              <w:right w:val="single" w:sz="4" w:space="0" w:color="251C53"/>
+            </w:tcBorders>
+          </w:tcPr>
+          <w:p>
+            <w:r>
+              <w:rPr>
+                <w:b/>
+                <w:color w:val="FFFFFF"/>
+                <w:sz w:val="20"/>
+              </w:rPr>
+              <w:t>Hoàn thành lúc</w:t>
+            </w:r>
+          </w:p>
+        </w:tc>
+      </w:tr>
+      <w:tr>
+        <w:tc>
+          <w:tcPr>
+            <w:tcW w:type="dxa" w:w="1615"/>
+            <w:tcBorders>
+              <w:top w:val="single" w:sz="4" w:space="0" w:color="CBCBCB"/>
+              <w:left w:val="single" w:sz="4" w:space="0" w:color="CBCBCB"/>
+              <w:bottom w:val="single" w:sz="4" w:space="0" w:color="CBCBCB"/>
+              <w:right w:val="single" w:sz="4" w:space="0" w:color="CBCBCB"/>
+            </w:tcBorders>
+          </w:tcPr>
+          <w:p>
+            <w:r>
+              <w:rPr>
+                <w:sz w:val="20"/>
+              </w:rPr>
+              <w:t>---</w:t>
+            </w:r>
+          </w:p>
+        </w:tc>
+        <w:tc>
+          <w:tcPr>
+            <w:tcW w:type="dxa" w:w="1615"/>
+            <w:tcBorders>
+              <w:top w:val="single" w:sz="4" w:space="0" w:color="CBCBCB"/>
+              <w:left w:val="single" w:sz="4" w:space="0" w:color="CBCBCB"/>
+              <w:bottom w:val="single" w:sz="4" w:space="0" w:color="CBCBCB"/>
+              <w:right w:val="single" w:sz="4" w:space="0" w:color="CBCBCB"/>
+            </w:tcBorders>
+          </w:tcPr>
+          <w:p>
+            <w:r>
+              <w:rPr>
+                <w:sz w:val="20"/>
+              </w:rPr>
+              <w:t>------</w:t>
+            </w:r>
+          </w:p>
+        </w:tc>
+        <w:tc>
+          <w:tcPr>
+            <w:tcW w:type="dxa" w:w="1615"/>
+            <w:tcBorders>
+              <w:top w:val="single" w:sz="4" w:space="0" w:color="CBCBCB"/>
+              <w:left w:val="single" w:sz="4" w:space="0" w:color="CBCBCB"/>
+              <w:bottom w:val="single" w:sz="4" w:space="0" w:color="CBCBCB"/>
+              <w:right w:val="single" w:sz="4" w:space="0" w:color="CBCBCB"/>
+            </w:tcBorders>
+          </w:tcPr>
+          <w:p>
+            <w:r>
+              <w:rPr>
+                <w:sz w:val="20"/>
+              </w:rPr>
+              <w:t>-------</w:t>
+            </w:r>
+          </w:p>
+        </w:tc>
+        <w:tc>
+          <w:tcPr>
+            <w:tcW w:type="dxa" w:w="1615"/>
+            <w:tcBorders>
+              <w:top w:val="single" w:sz="4" w:space="0" w:color="CBCBCB"/>
+              <w:left w:val="single" w:sz="4" w:space="0" w:color="CBCBCB"/>
+              <w:bottom w:val="single" w:sz="4" w:space="0" w:color="CBCBCB"/>
+              <w:right w:val="single" w:sz="4" w:space="0" w:color="CBCBCB"/>
+            </w:tcBorders>
+          </w:tcPr>
+          <w:p>
+            <w:r>
+              <w:rPr>
+                <w:sz w:val="20"/>
+              </w:rPr>
+              <w:t>--------</w:t>
+            </w:r>
+          </w:p>
+        </w:tc>
+        <w:tc>
+          <w:tcPr>
+            <w:tcW w:type="dxa" w:w="1615"/>
+            <w:tcBorders>
+              <w:top w:val="single" w:sz="4" w:space="0" w:color="CBCBCB"/>
+              <w:left w:val="single" w:sz="4" w:space="0" w:color="CBCBCB"/>
+              <w:bottom w:val="single" w:sz="4" w:space="0" w:color="CBCBCB"/>
+              <w:right w:val="single" w:sz="4" w:space="0" w:color="CBCBCB"/>
+            </w:tcBorders>
+          </w:tcPr>
+          <w:p>
+            <w:r>
+              <w:rPr>
+                <w:sz w:val="20"/>
+              </w:rPr>
+              <w:t>-----------</w:t>
+            </w:r>
+          </w:p>
+        </w:tc>
+        <w:tc>
+          <w:tcPr>
+            <w:tcW w:type="dxa" w:w="1615"/>
+            <w:tcBorders>
+              <w:top w:val="single" w:sz="4" w:space="0" w:color="CBCBCB"/>
+              <w:left w:val="single" w:sz="4" w:space="0" w:color="CBCBCB"/>
+              <w:bottom w:val="single" w:sz="4" w:space="0" w:color="CBCBCB"/>
+              <w:right w:val="single" w:sz="4" w:space="0" w:color="CBCBCB"/>
+            </w:tcBorders>
+          </w:tcPr>
+          <w:p>
+            <w:r>
+              <w:rPr>
+                <w:sz w:val="20"/>
+              </w:rPr>
+              <w:t>-----------------</w:t>
+            </w:r>
+          </w:p>
+        </w:tc>
+      </w:tr>
       <w:tr>
         <w:tc>
           <w:tcPr>
@@ -2390,7 +2736,7 @@
               <w:rPr>
                 <w:sz w:val="20"/>
               </w:rPr>
-              <w:t>3.1</w:t>
+              <w:t>3.2</w:t>
             </w:r>
           </w:p>
         </w:tc>
@@ -2408,9 +2754,16 @@
           <w:p>
             <w:r>
               <w:rPr>
+                <w:b/>
                 <w:sz w:val="20"/>
               </w:rPr>
-              <w:t>Viết phần ZCU: cài đặt .deb, systemd service, khóa SSH, kiểm tra hoạt động</w:t>
+              <w:t>(chạy trước)</w:t>
+            </w:r>
+            <w:r>
+              <w:rPr>
+                <w:sz w:val="20"/>
+              </w:rPr>
+              <w:t xml:space="preserve"> Viết phần CCU: thao tác từng màn hình theo Screen Inventory, chèn ảnh đúng chỗ — trở thành Phần 1 của MANUAL</w:t>
             </w:r>
           </w:p>
         </w:tc>
@@ -2472,7 +2825,7 @@
                 <w:color w:val="F05922"/>
                 <w:sz w:val="20"/>
               </w:rPr>
-              <w:t>steps/STEP-3.1-write-zcu.md</w:t>
+              <w:t>steps/STEP-3.2-write-ccu.md</w:t>
             </w:r>
           </w:p>
         </w:tc>
@@ -2513,7 +2866,7 @@
               <w:rPr>
                 <w:sz w:val="20"/>
               </w:rPr>
-              <w:t>3.2</w:t>
+              <w:t>3.1</w:t>
             </w:r>
           </w:p>
         </w:tc>
@@ -2530,9 +2883,16 @@
           <w:p>
             <w:r>
               <w:rPr>
+                <w:b/>
                 <w:sz w:val="20"/>
               </w:rPr>
-              <w:t>Viết phần CCU: thao tác từng màn hình theo Screen Inventory, chèn ảnh đúng chỗ, hoàn thiện MANUAL .md</w:t>
+              <w:t>(chạy sau)</w:t>
+            </w:r>
+            <w:r>
+              <w:rPr>
+                <w:sz w:val="20"/>
+              </w:rPr>
+              <w:t xml:space="preserve"> Viết phần ZCU: cài đặt .deb, systemd service, khóa SSH, kiểm tra hoạt động — trở thành Phần 2 của MANUAL</w:t>
             </w:r>
           </w:p>
         </w:tc>
@@ -2591,7 +2951,7 @@
                 <w:color w:val="F05922"/>
                 <w:sz w:val="20"/>
               </w:rPr>
-              <w:t>steps/STEP-3.2-write-ccu.md</w:t>
+              <w:t>steps/STEP-3.1-write-zcu.md</w:t>
             </w:r>
           </w:p>
         </w:tc>
@@ -3207,13 +3567,68 @@
     </w:p>
     <w:p>
       <w:pPr>
-        <w:spacing w:after="80"/>
+        <w:pStyle w:val="ListBullet"/>
+        <w:spacing w:after="20"/>
+        <w:ind w:left="283"/>
       </w:pPr>
       <w:r>
         <w:rPr>
           <w:sz w:val="21"/>
         </w:rPr>
-        <w:t>Không có (tại thời điểm tạo plan).</w:t>
+        <w:t xml:space="preserve">🛑 </w:t>
+      </w:r>
+      <w:r>
+        <w:rPr>
+          <w:b/>
+          <w:sz w:val="21"/>
+        </w:rPr>
+        <w:t>[2026-07-26 17:52 — Bước 2.2] ZCU `192.168.1.4` vẫn OFFLINE dù user báo đã bật lại VM.</w:t>
+      </w:r>
+      <w:r>
+        <w:rPr>
+          <w:sz w:val="21"/>
+        </w:rPr>
+        <w:t xml:space="preserve"> Ping fail ~6 phút liên tục (Destination host unreachable); cổng 22/17600 đóng; quét cả subnet 192.168.1.1–254 không thấy máy nào mở 2 cổng này (loại trừ khả năng đổi IP DHCP). Nghi vấn: VM đang ở network mode </w:t>
+      </w:r>
+      <w:r>
+        <w:rPr>
+          <w:b/>
+          <w:sz w:val="21"/>
+        </w:rPr>
+        <w:t>NAT thay vì Bridged</w:t>
+      </w:r>
+      <w:r>
+        <w:rPr>
+          <w:sz w:val="21"/>
+        </w:rPr>
+        <w:t xml:space="preserve">, hoặc VM chưa boot xong/treo. </w:t>
+      </w:r>
+      <w:r>
+        <w:rPr>
+          <w:b/>
+          <w:sz w:val="21"/>
+        </w:rPr>
+        <w:t>Cần user:</w:t>
+      </w:r>
+      <w:r>
+        <w:rPr>
+          <w:sz w:val="21"/>
+        </w:rPr>
+        <w:t xml:space="preserve"> kiểm tra VM (chế độ mạng Bridged, chạy </w:t>
+      </w:r>
+      <w:r>
+        <w:rPr>
+          <w:rFonts w:ascii="Courier New" w:hAnsi="Courier New"/>
+          <w:color w:val="F05922"/>
+          <w:sz w:val="21"/>
+        </w:rPr>
+        <w:t>ip a</w:t>
+      </w:r>
+      <w:r>
+        <w:rPr>
+          <w:sz w:val="21"/>
+        </w:rPr>
+        <w:t xml:space="preserve"> trong VM xác nhận IP) rồi yêu cầu chạy tiếp bước 2.2 — 24/28 ảnh nhóm 2.2 + 2 ảnh bù 2.1 + dữ liệu demo SSH đang chờ.</w:t>
       </w:r>
     </w:p>
     <w:p>
@@ -3397,7 +3812,142 @@
         <w:rPr>
           <w:sz w:val="21"/>
         </w:rPr>
-        <w:t xml:space="preserve"> — Phần 1 = triển khai ZCU, Phần 2 = thao tác CCU. KHÔNG tách 2 file.</w:t>
+        <w:t>. KHÔNG tách 2 file.</w:t>
+      </w:r>
+    </w:p>
+    <w:p>
+      <w:pPr>
+        <w:pStyle w:val="ListBullet"/>
+        <w:spacing w:after="20"/>
+        <w:ind w:left="283"/>
+      </w:pPr>
+      <w:r>
+        <w:rPr>
+          <w:b/>
+          <w:sz w:val="21"/>
+        </w:rPr>
+        <w:t>[USER ĐỔI Ý 2026-07-26 — ưu tiên cao hơn mọi ghi chú cũ]</w:t>
+      </w:r>
+      <w:r>
+        <w:rPr>
+          <w:sz w:val="21"/>
+        </w:rPr>
+        <w:t xml:space="preserve"> Thứ tự trong MANUAL: </w:t>
+      </w:r>
+      <w:r>
+        <w:rPr>
+          <w:b/>
+          <w:sz w:val="21"/>
+        </w:rPr>
+        <w:t>Phần 1 = CCU (thao tác app)</w:t>
+      </w:r>
+      <w:r>
+        <w:rPr>
+          <w:sz w:val="21"/>
+        </w:rPr>
+        <w:t xml:space="preserve">, </w:t>
+      </w:r>
+      <w:r>
+        <w:rPr>
+          <w:b/>
+          <w:sz w:val="21"/>
+        </w:rPr>
+        <w:t>Phần 2 = ZCU (triển khai)</w:t>
+      </w:r>
+      <w:r>
+        <w:rPr>
+          <w:sz w:val="21"/>
+        </w:rPr>
+        <w:t xml:space="preserve">. Viết CCU trước, ZCU sau → chạy </w:t>
+      </w:r>
+      <w:r>
+        <w:rPr>
+          <w:b/>
+          <w:sz w:val="21"/>
+        </w:rPr>
+        <w:t>STEP-3.2 trước STEP-3.1</w:t>
+      </w:r>
+      <w:r>
+        <w:rPr>
+          <w:sz w:val="21"/>
+        </w:rPr>
+        <w:t xml:space="preserve">. Mục lục 16 chương ở </w:t>
+      </w:r>
+      <w:r>
+        <w:rPr>
+          <w:rFonts w:ascii="Courier New" w:hAnsi="Courier New"/>
+          <w:color w:val="F05922"/>
+          <w:sz w:val="21"/>
+        </w:rPr>
+        <w:t>_workspace/00_pm_docs-scope.md</w:t>
+      </w:r>
+      <w:r>
+        <w:rPr>
+          <w:sz w:val="21"/>
+        </w:rPr>
+        <w:t xml:space="preserve"> phải đánh số lại theo thứ tự mới khi viết.</w:t>
+      </w:r>
+    </w:p>
+    <w:p>
+      <w:pPr>
+        <w:pStyle w:val="ListBullet"/>
+        <w:spacing w:after="20"/>
+        <w:ind w:left="283"/>
+      </w:pPr>
+      <w:r>
+        <w:rPr>
+          <w:b/>
+          <w:sz w:val="21"/>
+        </w:rPr>
+        <w:t>[USER 2026-07-26]</w:t>
+      </w:r>
+      <w:r>
+        <w:rPr>
+          <w:sz w:val="21"/>
+        </w:rPr>
+        <w:t xml:space="preserve"> Máy ảo ZCU </w:t>
+      </w:r>
+      <w:r>
+        <w:rPr>
+          <w:rFonts w:ascii="Courier New" w:hAnsi="Courier New"/>
+          <w:color w:val="F05922"/>
+          <w:sz w:val="21"/>
+        </w:rPr>
+        <w:t>192.168.1.4</w:t>
+      </w:r>
+      <w:r>
+        <w:rPr>
+          <w:sz w:val="21"/>
+        </w:rPr>
+        <w:t xml:space="preserve"> đã được bật lại sau bước 2.1 → bước 2.2 kiểm tra kết nối lại và chụp bù </w:t>
+      </w:r>
+      <w:r>
+        <w:rPr>
+          <w:rFonts w:ascii="Courier New" w:hAnsi="Courier New"/>
+          <w:color w:val="F05922"/>
+          <w:sz w:val="21"/>
+        </w:rPr>
+        <w:t>network-scan-results.png</w:t>
+      </w:r>
+      <w:r>
+        <w:rPr>
+          <w:sz w:val="21"/>
+        </w:rPr>
+        <w:t xml:space="preserve"> + chụp lại </w:t>
+      </w:r>
+      <w:r>
+        <w:rPr>
+          <w:rFonts w:ascii="Courier New" w:hAnsi="Courier New"/>
+          <w:color w:val="F05922"/>
+          <w:sz w:val="21"/>
+        </w:rPr>
+        <w:t>connection-entry-default.png</w:t>
+      </w:r>
+      <w:r>
+        <w:rPr>
+          <w:sz w:val="21"/>
+        </w:rPr>
+        <w:t xml:space="preserve"> (P01 online).</w:t>
       </w:r>
     </w:p>
     <w:p>
@@ -4302,6 +4852,137 @@
               <w:rPr>
                 <w:sz w:val="20"/>
               </w:rPr>
+              <w:t>Bước 2.2 🛑 BLOCKED — ZCU 192.168.1.4 vẫn offline (ping+cổng 22/17600 fail ~6 phút, quét subnet không thấy); chụp được 4/28 ảnh không cần ZCU (</w:t>
+            </w:r>
+            <w:r>
+              <w:rPr>
+                <w:rFonts w:ascii="Courier New" w:hAnsi="Courier New"/>
+                <w:color w:val="F05922"/>
+                <w:sz w:val="20"/>
+              </w:rPr>
+              <w:t>remote-screen-connecting/-ssh-help/-faulted</w:t>
+            </w:r>
+            <w:r>
+              <w:rPr>
+                <w:sz w:val="20"/>
+              </w:rPr>
+              <w:t xml:space="preserve">, </w:t>
+            </w:r>
+            <w:r>
+              <w:rPr>
+                <w:rFonts w:ascii="Courier New" w:hAnsi="Courier New"/>
+                <w:color w:val="F05922"/>
+                <w:sz w:val="20"/>
+              </w:rPr>
+              <w:t>multi-remote-empty</w:t>
+            </w:r>
+            <w:r>
+              <w:rPr>
+                <w:sz w:val="20"/>
+              </w:rPr>
+              <w:t xml:space="preserve"> — verify bằng Read); 2 ảnh bù 2.1 (</w:t>
+            </w:r>
+            <w:r>
+              <w:rPr>
+                <w:rFonts w:ascii="Courier New" w:hAnsi="Courier New"/>
+                <w:color w:val="F05922"/>
+                <w:sz w:val="20"/>
+              </w:rPr>
+              <w:t>network-scan-results</w:t>
+            </w:r>
+            <w:r>
+              <w:rPr>
+                <w:sz w:val="20"/>
+              </w:rPr>
+              <w:t xml:space="preserve">, </w:t>
+            </w:r>
+            <w:r>
+              <w:rPr>
+                <w:rFonts w:ascii="Courier New" w:hAnsi="Courier New"/>
+                <w:color w:val="F05922"/>
+                <w:sz w:val="20"/>
+              </w:rPr>
+              <w:t>connection-entry-default</w:t>
+            </w:r>
+            <w:r>
+              <w:rPr>
+                <w:sz w:val="20"/>
+              </w:rPr>
+              <w:t xml:space="preserve"> P01 online) CHƯA chụp được — cùng chờ ZCU; tool mới </w:t>
+            </w:r>
+            <w:r>
+              <w:rPr>
+                <w:rFonts w:ascii="Courier New" w:hAnsi="Courier New"/>
+                <w:color w:val="F05922"/>
+                <w:sz w:val="20"/>
+              </w:rPr>
+              <w:t>temp/user-manual-ccu-zcu/actions-22.ps1</w:t>
+            </w:r>
+            <w:r>
+              <w:rPr>
+                <w:sz w:val="20"/>
+              </w:rPr>
+              <w:t xml:space="preserve"> (double-click item mở RemoteScreen)</w:t>
+            </w:r>
+          </w:p>
+        </w:tc>
+        <w:tc>
+          <w:tcPr>
+            <w:tcW w:type="dxa" w:w="3230"/>
+            <w:tcBorders>
+              <w:top w:val="single" w:sz="4" w:space="0" w:color="CBCBCB"/>
+              <w:left w:val="single" w:sz="4" w:space="0" w:color="CBCBCB"/>
+              <w:bottom w:val="single" w:sz="4" w:space="0" w:color="CBCBCB"/>
+              <w:right w:val="single" w:sz="4" w:space="0" w:color="CBCBCB"/>
+            </w:tcBorders>
+          </w:tcPr>
+          <w:p>
+            <w:r>
+              <w:rPr>
+                <w:sz w:val="20"/>
+              </w:rPr>
+              <w:t>documentation-writer</w:t>
+            </w:r>
+          </w:p>
+        </w:tc>
+      </w:tr>
+      <w:tr>
+        <w:tc>
+          <w:tcPr>
+            <w:tcW w:type="dxa" w:w="3230"/>
+            <w:shd w:val="clear" w:color="auto" w:fill="B8B3D6"/>
+            <w:tcBorders>
+              <w:top w:val="single" w:sz="4" w:space="0" w:color="CBCBCB"/>
+              <w:left w:val="single" w:sz="4" w:space="0" w:color="CBCBCB"/>
+              <w:bottom w:val="single" w:sz="4" w:space="0" w:color="CBCBCB"/>
+              <w:right w:val="single" w:sz="4" w:space="0" w:color="CBCBCB"/>
+            </w:tcBorders>
+          </w:tcPr>
+          <w:p>
+            <w:r>
+              <w:rPr>
+                <w:sz w:val="20"/>
+              </w:rPr>
+              <w:t>2026-07-26</w:t>
+            </w:r>
+          </w:p>
+        </w:tc>
+        <w:tc>
+          <w:tcPr>
+            <w:tcW w:type="dxa" w:w="3230"/>
+            <w:shd w:val="clear" w:color="auto" w:fill="B8B3D6"/>
+            <w:tcBorders>
+              <w:top w:val="single" w:sz="4" w:space="0" w:color="CBCBCB"/>
+              <w:left w:val="single" w:sz="4" w:space="0" w:color="CBCBCB"/>
+              <w:bottom w:val="single" w:sz="4" w:space="0" w:color="CBCBCB"/>
+              <w:right w:val="single" w:sz="4" w:space="0" w:color="CBCBCB"/>
+            </w:tcBorders>
+          </w:tcPr>
+          <w:p>
+            <w:r>
+              <w:rPr>
+                <w:sz w:val="20"/>
+              </w:rPr>
               <w:t xml:space="preserve">Bước 2.1 ✅ — 15/16 ảnh nhóm Kết nối &amp; Quản lý thiết bị (verify từng ảnh bằng Read); 🛑 thiếu </w:t>
             </w:r>
             <w:r>
@@ -4351,6 +5032,7 @@
         <w:tc>
           <w:tcPr>
             <w:tcW w:type="dxa" w:w="3230"/>
+            <w:shd w:val="clear" w:color="auto" w:fill="B8B3D6"/>
             <w:tcBorders>
               <w:top w:val="single" w:sz="4" w:space="0" w:color="CBCBCB"/>
               <w:left w:val="single" w:sz="4" w:space="0" w:color="CBCBCB"/>

</xml_diff>

<commit_message>
[user-manual-ccu-zcu] Bước 3.2: Viết Phần 1 — HDSD sử dụng phần mềm CCU
- Tạo docs/user-manuals/MANUAL-ccu-zcu-remote-control.md (BẢN NHÁP — CHỜ BỔ SUNG ẢNH): Phần 1 CCU phủ 18/18 màn hình theo Screen Inventory, chương đánh số mới (CCU trước, ZCU sau)
- Chèn 19 ảnh thật (Hình 1–19), 52 marker ⏳ CHỜ ẢNH đúng vị trí + Phụ lục A checklist ảnh thiếu kèm điều kiện tiên quyết
- Khung Phần 2 ZCU (ch11–13) + FAQ 14.1 để 🚧 chờ bước 3.1; verify 0 link ảnh chết
- Cập nhật STEP-3.2 (done, Handoff Log) + PLAN-MASTER (3.2 ✅, xuất DOCX; PDF fail docx2pdf RPC — ghi chú)

Plan: docs/plans/PLAN-user-manual-ccu-zcu-2026-07-26/steps/STEP-3.2-write-ccu.md
Co-Authored-By: Claude Opus 5 (1M context) <noreply@anthropic.com>
</commit_message>
<xml_diff>
--- a/docs/plans/PLAN-user-manual-ccu-zcu-2026-07-26/PLAN-MASTER.docx
+++ b/docs/plans/PLAN-user-manual-ccu-zcu-2026-07-26/PLAN-MASTER.docx
@@ -40,7 +40,7 @@
         <w:rPr>
           <w:sz w:val="21"/>
         </w:rPr>
-        <w:t>updated: 2026-07-26 17:52</w:t>
+        <w:t>updated: 2026-07-26 18:06</w:t>
       </w:r>
     </w:p>
     <w:p>
@@ -1869,7 +1869,7 @@
               <w:rPr>
                 <w:sz w:val="20"/>
               </w:rPr>
-              <w:t>2.3</w:t>
+              <w:t>2.3 (HOÃN)</w:t>
             </w:r>
           </w:p>
         </w:tc>
@@ -1929,7 +1929,7 @@
               <w:rPr>
                 <w:sz w:val="20"/>
               </w:rPr>
-              <w:t>⬜</w:t>
+              <w:t>⏭️</w:t>
             </w:r>
           </w:p>
         </w:tc>
@@ -1992,7 +1992,7 @@
               <w:rPr>
                 <w:sz w:val="20"/>
               </w:rPr>
-              <w:t>2.4</w:t>
+              <w:t>2.4 (HOÃN)</w:t>
             </w:r>
           </w:p>
         </w:tc>
@@ -2049,7 +2049,7 @@
               <w:rPr>
                 <w:sz w:val="20"/>
               </w:rPr>
-              <w:t>⬜</w:t>
+              <w:t>⏭️</w:t>
             </w:r>
           </w:p>
         </w:tc>
@@ -2803,7 +2803,7 @@
               <w:rPr>
                 <w:sz w:val="20"/>
               </w:rPr>
-              <w:t>⬜</w:t>
+              <w:t>✅</w:t>
             </w:r>
           </w:p>
         </w:tc>
@@ -2845,7 +2845,7 @@
               <w:rPr>
                 <w:sz w:val="20"/>
               </w:rPr>
-              <w:t>-</w:t>
+              <w:t>2026-07-26 18:05</w:t>
             </w:r>
           </w:p>
         </w:tc>
@@ -3899,7 +3899,7 @@
           <w:b/>
           <w:sz w:val="21"/>
         </w:rPr>
-        <w:t>[USER 2026-07-26]</w:t>
+        <w:t>[USER 2026-07-26 — ĐỔI THỨ TỰ THI CÔNG, ưu tiên cao nhất]</w:t>
       </w:r>
       <w:r>
         <w:rPr>
@@ -3919,7 +3919,85 @@
         <w:rPr>
           <w:sz w:val="21"/>
         </w:rPr>
-        <w:t xml:space="preserve"> đã được bật lại sau bước 2.1 → bước 2.2 kiểm tra kết nối lại và chụp bù </w:t>
+        <w:t xml:space="preserve"> </w:t>
+      </w:r>
+      <w:r>
+        <w:rPr>
+          <w:b/>
+          <w:sz w:val="21"/>
+        </w:rPr>
+        <w:t>bị lỗi, không kết nối được</w:t>
+      </w:r>
+      <w:r>
+        <w:rPr>
+          <w:sz w:val="21"/>
+        </w:rPr>
+        <w:t xml:space="preserve"> (bước 2.2 BLOCK ở 4/28 ảnh). User quyết định: </w:t>
+      </w:r>
+      <w:r>
+        <w:rPr>
+          <w:b/>
+          <w:sz w:val="21"/>
+        </w:rPr>
+        <w:t>viết tài liệu trước, bổ sung ảnh sau</w:t>
+      </w:r>
+      <w:r>
+        <w:rPr>
+          <w:sz w:val="21"/>
+        </w:rPr>
+        <w:t>.</w:t>
+      </w:r>
+    </w:p>
+    <w:p>
+      <w:pPr>
+        <w:pStyle w:val="ListBullet"/>
+        <w:spacing w:after="20"/>
+        <w:ind w:left="567"/>
+      </w:pPr>
+      <w:r>
+        <w:rPr>
+          <w:sz w:val="21"/>
+        </w:rPr>
+        <w:t xml:space="preserve">Phase 2 còn lại (phần thiếu của 2.2, toàn bộ 2.3, 2.4) → </w:t>
+      </w:r>
+      <w:r>
+        <w:rPr>
+          <w:b/>
+          <w:sz w:val="21"/>
+        </w:rPr>
+        <w:t>HOÃN</w:t>
+      </w:r>
+      <w:r>
+        <w:rPr>
+          <w:sz w:val="21"/>
+        </w:rPr>
+        <w:t xml:space="preserve"> sang sau Phase 3, chạy lại khi VM hoạt động.</w:t>
+      </w:r>
+    </w:p>
+    <w:p>
+      <w:pPr>
+        <w:pStyle w:val="ListBullet"/>
+        <w:spacing w:after="20"/>
+        <w:ind w:left="567"/>
+      </w:pPr>
+      <w:r>
+        <w:rPr>
+          <w:sz w:val="21"/>
+        </w:rPr>
+        <w:t xml:space="preserve">Phase 3 (3.2 CCU → 3.1 ZCU) chạy NGAY với </w:t>
+      </w:r>
+      <w:r>
+        <w:rPr>
+          <w:b/>
+          <w:sz w:val="21"/>
+        </w:rPr>
+        <w:t>19 ảnh thật đã có</w:t>
+      </w:r>
+      <w:r>
+        <w:rPr>
+          <w:sz w:val="21"/>
+        </w:rPr>
+        <w:t xml:space="preserve">; mọi vị trí thiếu ảnh phải chèn marker rõ ràng dạng </w:t>
       </w:r>
       <w:r>
         <w:rPr>
@@ -3927,13 +4005,13 @@
           <w:color w:val="F05922"/>
           <w:sz w:val="21"/>
         </w:rPr>
-        <w:t>network-scan-results.png</w:t>
+        <w:t xml:space="preserve">&gt; ⏳ **[CHỜ ẢNH: </w:t>
       </w:r>
       <w:r>
         <w:rPr>
           <w:sz w:val="21"/>
         </w:rPr>
-        <w:t xml:space="preserve"> + chụp lại </w:t>
+        <w:t>&lt;ten-file&gt;.png</w:t>
       </w:r>
       <w:r>
         <w:rPr>
@@ -3941,13 +4019,46 @@
           <w:color w:val="F05922"/>
           <w:sz w:val="21"/>
         </w:rPr>
-        <w:t>connection-entry-default.png</w:t>
+        <w:t xml:space="preserve"> — mô tả cần chụp gì]**</w:t>
       </w:r>
       <w:r>
         <w:rPr>
           <w:sz w:val="21"/>
         </w:rPr>
-        <w:t xml:space="preserve"> (P01 online).</w:t>
+        <w:t xml:space="preserve"> để lần bổ sung sau chỉ việc thay marker bằng ảnh. </w:t>
+      </w:r>
+      <w:r>
+        <w:rPr>
+          <w:b/>
+          <w:sz w:val="21"/>
+        </w:rPr>
+        <w:t>TUYỆT ĐỐI KHÔNG dùng ảnh giả/placeholder/ảnh tái sử dụng sai ngữ cảnh.</w:t>
+      </w:r>
+    </w:p>
+    <w:p>
+      <w:pPr>
+        <w:pStyle w:val="ListBullet"/>
+        <w:spacing w:after="20"/>
+        <w:ind w:left="567"/>
+      </w:pPr>
+      <w:r>
+        <w:rPr>
+          <w:sz w:val="21"/>
+        </w:rPr>
+        <w:t xml:space="preserve">Phase 4 (xuất DOCX/PDF) chỉ được coi là </w:t>
+      </w:r>
+      <w:r>
+        <w:rPr>
+          <w:b/>
+          <w:sz w:val="21"/>
+        </w:rPr>
+        <w:t>BẢN NHÁP</w:t>
+      </w:r>
+      <w:r>
+        <w:rPr>
+          <w:sz w:val="21"/>
+        </w:rPr>
+        <w:t xml:space="preserve"> cho tới khi đủ ảnh — Definition of Done đầy đủ của WF-DOCS chưa đạt cho tới lúc đó, phải nói rõ với user.</w:t>
       </w:r>
     </w:p>
     <w:p>
@@ -4983,6 +5094,80 @@
               <w:rPr>
                 <w:sz w:val="20"/>
               </w:rPr>
+              <w:t xml:space="preserve">Bước 3.2 ✅ — Tạo </w:t>
+            </w:r>
+            <w:r>
+              <w:rPr>
+                <w:rFonts w:ascii="Courier New" w:hAnsi="Courier New"/>
+                <w:color w:val="F05922"/>
+                <w:sz w:val="20"/>
+              </w:rPr>
+              <w:t>docs/user-manuals/MANUAL-ccu-zcu-remote-control.md</w:t>
+            </w:r>
+            <w:r>
+              <w:rPr>
+                <w:sz w:val="20"/>
+              </w:rPr>
+              <w:t xml:space="preserve"> (BẢN NHÁP): Phần 1 CCU hoàn chỉnh phủ 18/18 màn hình (ch3–10, đánh số chương MỚI: CCU trước, ZCU sau), 19 ảnh thật chèn (Hình 1–19), 52 marker ⏳ CHỜ ẢNH + Phụ lục A checklist bổ sung; Phần 2 ZCU (ch11–13) để khung 🚧 chờ bước 3.1; verify 0 link ảnh chết</w:t>
+            </w:r>
+          </w:p>
+        </w:tc>
+        <w:tc>
+          <w:tcPr>
+            <w:tcW w:type="dxa" w:w="3230"/>
+            <w:shd w:val="clear" w:color="auto" w:fill="B8B3D6"/>
+            <w:tcBorders>
+              <w:top w:val="single" w:sz="4" w:space="0" w:color="CBCBCB"/>
+              <w:left w:val="single" w:sz="4" w:space="0" w:color="CBCBCB"/>
+              <w:bottom w:val="single" w:sz="4" w:space="0" w:color="CBCBCB"/>
+              <w:right w:val="single" w:sz="4" w:space="0" w:color="CBCBCB"/>
+            </w:tcBorders>
+          </w:tcPr>
+          <w:p>
+            <w:r>
+              <w:rPr>
+                <w:sz w:val="20"/>
+              </w:rPr>
+              <w:t>documentation-writer</w:t>
+            </w:r>
+          </w:p>
+        </w:tc>
+      </w:tr>
+      <w:tr>
+        <w:tc>
+          <w:tcPr>
+            <w:tcW w:type="dxa" w:w="3230"/>
+            <w:tcBorders>
+              <w:top w:val="single" w:sz="4" w:space="0" w:color="CBCBCB"/>
+              <w:left w:val="single" w:sz="4" w:space="0" w:color="CBCBCB"/>
+              <w:bottom w:val="single" w:sz="4" w:space="0" w:color="CBCBCB"/>
+              <w:right w:val="single" w:sz="4" w:space="0" w:color="CBCBCB"/>
+            </w:tcBorders>
+          </w:tcPr>
+          <w:p>
+            <w:r>
+              <w:rPr>
+                <w:sz w:val="20"/>
+              </w:rPr>
+              <w:t>2026-07-26</w:t>
+            </w:r>
+          </w:p>
+        </w:tc>
+        <w:tc>
+          <w:tcPr>
+            <w:tcW w:type="dxa" w:w="3230"/>
+            <w:tcBorders>
+              <w:top w:val="single" w:sz="4" w:space="0" w:color="CBCBCB"/>
+              <w:left w:val="single" w:sz="4" w:space="0" w:color="CBCBCB"/>
+              <w:bottom w:val="single" w:sz="4" w:space="0" w:color="CBCBCB"/>
+              <w:right w:val="single" w:sz="4" w:space="0" w:color="CBCBCB"/>
+            </w:tcBorders>
+          </w:tcPr>
+          <w:p>
+            <w:r>
+              <w:rPr>
+                <w:sz w:val="20"/>
+              </w:rPr>
               <w:t xml:space="preserve">Bước 2.1 ✅ — 15/16 ảnh nhóm Kết nối &amp; Quản lý thiết bị (verify từng ảnh bằng Read); 🛑 thiếu </w:t>
             </w:r>
             <w:r>
@@ -5032,7 +5217,6 @@
         <w:tc>
           <w:tcPr>
             <w:tcW w:type="dxa" w:w="3230"/>
-            <w:shd w:val="clear" w:color="auto" w:fill="B8B3D6"/>
             <w:tcBorders>
               <w:top w:val="single" w:sz="4" w:space="0" w:color="CBCBCB"/>
               <w:left w:val="single" w:sz="4" w:space="0" w:color="CBCBCB"/>

</xml_diff>

<commit_message>
[user-manual-ccu-zcu] Bước 4.1: Xuất bản nháp DOCX + PDF của HDSD CCU/ZCU
- Rà soát MANUAL: 19 ảnh thật (0 link chết) / 61 marker CHỜ ẢNH / 61 dòng Phụ lục A khớp; mục lục khớp 15 chương; không có credential thật
- Thêm dòng thống kê 19/61 vào nhãn BẢN NHÁP đầu tài liệu
- Xuất MANUAL .docx (967 KB, 20 ảnh nhúng verify) + .pdf (1,7 MB) thành công
- Checklist DoD documentation-writer: 2 mục coverage ảnh FAIL (61 ảnh chờ VM ZCU) -> bản NHÁP, plan giữ in-progress
- PLAN-MASTER: 4.1 done, artifacts tick, blockers cập nhật hiện trạng ZCU offline; PDF PLAN-MASTER fail (docx2pdf RPC) - chỉ DOCX

Plan: docs/plans/PLAN-user-manual-ccu-zcu-2026-07-26/steps/STEP-4.1-export-verify.md
Co-Authored-By: Claude Opus 5 (1M context) <noreply@anthropic.com>
</commit_message>
<xml_diff>
--- a/docs/plans/PLAN-user-manual-ccu-zcu-2026-07-26/PLAN-MASTER.docx
+++ b/docs/plans/PLAN-user-manual-ccu-zcu-2026-07-26/PLAN-MASTER.docx
@@ -40,7 +40,7 @@
         <w:rPr>
           <w:sz w:val="21"/>
         </w:rPr>
-        <w:t>updated: 2026-07-26 18:13</w:t>
+        <w:t>updated: 2026-07-26 18:18</w:t>
       </w:r>
     </w:p>
     <w:p>
@@ -51,7 +51,7 @@
         <w:rPr>
           <w:sz w:val="21"/>
         </w:rPr>
-        <w:t>status: planning</w:t>
+        <w:t>status: in-progress</w:t>
       </w:r>
     </w:p>
     <w:p>
@@ -3345,7 +3345,7 @@
               <w:rPr>
                 <w:sz w:val="20"/>
               </w:rPr>
-              <w:t>⬜</w:t>
+              <w:t>✅</w:t>
             </w:r>
           </w:p>
         </w:tc>
@@ -3387,7 +3387,7 @@
               <w:rPr>
                 <w:sz w:val="20"/>
               </w:rPr>
-              <w:t>-</w:t>
+              <w:t>2026-07-26 18:18 (BẢN NHÁP — chạy lại sau khi đủ ảnh)</w:t>
             </w:r>
           </w:p>
         </w:tc>
@@ -3417,7 +3417,7 @@
         <w:rPr>
           <w:sz w:val="21"/>
         </w:rPr>
-        <w:t xml:space="preserve">[ ] </w:t>
+        <w:t xml:space="preserve">[x] </w:t>
       </w:r>
       <w:r>
         <w:rPr>
@@ -3426,6 +3426,12 @@
           <w:sz w:val="21"/>
         </w:rPr>
         <w:t>docs/user-manuals/MANUAL-ccu-zcu-remote-control.md</w:t>
+      </w:r>
+      <w:r>
+        <w:rPr>
+          <w:sz w:val="21"/>
+        </w:rPr>
+        <w:t xml:space="preserve"> — ✅ BẢN NHÁP (19 ảnh thật, 61 marker ⏳)</w:t>
       </w:r>
     </w:p>
     <w:p>
@@ -3438,7 +3444,7 @@
         <w:rPr>
           <w:sz w:val="21"/>
         </w:rPr>
-        <w:t xml:space="preserve">[ ] </w:t>
+        <w:t xml:space="preserve">[x] </w:t>
       </w:r>
       <w:r>
         <w:rPr>
@@ -3447,6 +3453,12 @@
           <w:sz w:val="21"/>
         </w:rPr>
         <w:t>docs/user-manuals/MANUAL-ccu-zcu-remote-control.docx</w:t>
+      </w:r>
+      <w:r>
+        <w:rPr>
+          <w:sz w:val="21"/>
+        </w:rPr>
+        <w:t xml:space="preserve"> — ✅ BẢN NHÁP (967 KB, 20 ảnh nhúng)</w:t>
       </w:r>
     </w:p>
     <w:p>
@@ -3459,7 +3471,7 @@
         <w:rPr>
           <w:sz w:val="21"/>
         </w:rPr>
-        <w:t xml:space="preserve">[ ] </w:t>
+        <w:t xml:space="preserve">[x] </w:t>
       </w:r>
       <w:r>
         <w:rPr>
@@ -3468,6 +3480,12 @@
           <w:sz w:val="21"/>
         </w:rPr>
         <w:t>docs/user-manuals/MANUAL-ccu-zcu-remote-control.pdf</w:t>
+      </w:r>
+      <w:r>
+        <w:rPr>
+          <w:sz w:val="21"/>
+        </w:rPr>
+        <w:t xml:space="preserve"> — ✅ BẢN NHÁP (1,7 MB)</w:t>
       </w:r>
     </w:p>
     <w:p>
@@ -3494,7 +3512,7 @@
         <w:rPr>
           <w:sz w:val="21"/>
         </w:rPr>
-        <w:t xml:space="preserve"> (đủ 100% màn hình theo Screen Inventory bước 0.2)</w:t>
+        <w:t xml:space="preserve"> (đủ 100% màn hình theo Screen Inventory bước 0.2) — hiện 19/80, còn 61 chờ VM ZCU</w:t>
       </w:r>
     </w:p>
     <w:p>
@@ -3507,7 +3525,7 @@
         <w:rPr>
           <w:sz w:val="21"/>
         </w:rPr>
-        <w:t xml:space="preserve">[ ] </w:t>
+        <w:t xml:space="preserve">[x] </w:t>
       </w:r>
       <w:r>
         <w:rPr>
@@ -3582,26 +3600,26 @@
           <w:b/>
           <w:sz w:val="21"/>
         </w:rPr>
-        <w:t>[2026-07-26 17:52 — Bước 2.2] ZCU `192.168.1.4` vẫn OFFLINE dù user báo đã bật lại VM.</w:t>
+        <w:t>[Hiện trạng sau 4.1 — 2026-07-26 18:18] VM ZCU `192.168.1.4` OFFLINE → Phase 2 còn dở:</w:t>
       </w:r>
       <w:r>
         <w:rPr>
           <w:sz w:val="21"/>
         </w:rPr>
-        <w:t xml:space="preserve"> Ping fail ~6 phút liên tục (Destination host unreachable); cổng 22/17600 đóng; quét cả subnet 192.168.1.1–254 không thấy máy nào mở 2 cổng này (loại trừ khả năng đổi IP DHCP). Nghi vấn: VM đang ở network mode </w:t>
+        <w:t xml:space="preserve"> bước 2.2 mới có 4/28 ảnh (+2 ảnh bù 2.1 chưa chụp), bước 2.3 và 2.4 HOÃN toàn bộ. Tổng 61 ảnh chờ chụp (đã liệt kê tại Phụ lục A của MANUAL). Bản DOCX/PDF vừa xuất là </w:t>
       </w:r>
       <w:r>
         <w:rPr>
           <w:b/>
           <w:sz w:val="21"/>
         </w:rPr>
-        <w:t>NAT thay vì Bridged</w:t>
+        <w:t>BẢN NHÁP</w:t>
       </w:r>
       <w:r>
         <w:rPr>
           <w:sz w:val="21"/>
         </w:rPr>
-        <w:t xml:space="preserve">, hoặc VM chưa boot xong/treo. </w:t>
+        <w:t xml:space="preserve"> — chưa đạt DoD đầy đủ WF-DOCS. </w:t>
       </w:r>
       <w:r>
         <w:rPr>
@@ -3614,7 +3632,7 @@
         <w:rPr>
           <w:sz w:val="21"/>
         </w:rPr>
-        <w:t xml:space="preserve"> kiểm tra VM (chế độ mạng Bridged, chạy </w:t>
+        <w:t xml:space="preserve"> sửa VM (nghi NAT thay vì Bridged / VM treo — kiểm tra </w:t>
       </w:r>
       <w:r>
         <w:rPr>
@@ -3628,7 +3646,21 @@
         <w:rPr>
           <w:sz w:val="21"/>
         </w:rPr>
-        <w:t xml:space="preserve"> trong VM xác nhận IP) rồi yêu cầu chạy tiếp bước 2.2 — 24/28 ảnh nhóm 2.2 + 2 ảnh bù 2.1 + dữ liệu demo SSH đang chờ.</w:t>
+        <w:t xml:space="preserve">, cổng 22/17600) rồi yêu cầu chạy tiếp 2.2 → 2.3 → 2.4 → thay 61 marker → khôi phục profile store từ </w:t>
+      </w:r>
+      <w:r>
+        <w:rPr>
+          <w:rFonts w:ascii="Courier New" w:hAnsi="Courier New"/>
+          <w:color w:val="F05922"/>
+          <w:sz w:val="21"/>
+        </w:rPr>
+        <w:t>temp/user-manual-ccu-zcu/profiles.backup.json</w:t>
+      </w:r>
+      <w:r>
+        <w:rPr>
+          <w:sz w:val="21"/>
+        </w:rPr>
+        <w:t xml:space="preserve"> → xuất lại DOCX/PDF (chạy lại 4.1).</w:t>
       </w:r>
     </w:p>
     <w:p>
@@ -5229,6 +5261,66 @@
               <w:rPr>
                 <w:sz w:val="20"/>
               </w:rPr>
+              <w:t>Bước 4.1 ✅ (BẢN NHÁP) — Rà soát MANUAL (19 ảnh/61 marker/61 dòng Phụ lục A khớp, 0 link chết, 0 credential thật, mục lục khớp 15 chương); thêm dòng thống kê 19/61 vào nhãn nháp; xuất DOCX (967 KB, 20 ảnh nhúng verify) + PDF (1,7 MB) thành công lần 1; checklist DoD ghi trong step file — 2 mục coverage ảnh ❌ → plan giữ in-progress, chờ VM ZCU để chạy lại 2.2/2.3/2.4 rồi xuất lại</w:t>
+            </w:r>
+          </w:p>
+        </w:tc>
+        <w:tc>
+          <w:tcPr>
+            <w:tcW w:type="dxa" w:w="3230"/>
+            <w:shd w:val="clear" w:color="auto" w:fill="B8B3D6"/>
+            <w:tcBorders>
+              <w:top w:val="single" w:sz="4" w:space="0" w:color="CBCBCB"/>
+              <w:left w:val="single" w:sz="4" w:space="0" w:color="CBCBCB"/>
+              <w:bottom w:val="single" w:sz="4" w:space="0" w:color="CBCBCB"/>
+              <w:right w:val="single" w:sz="4" w:space="0" w:color="CBCBCB"/>
+            </w:tcBorders>
+          </w:tcPr>
+          <w:p>
+            <w:r>
+              <w:rPr>
+                <w:sz w:val="20"/>
+              </w:rPr>
+              <w:t>documentation-writer</w:t>
+            </w:r>
+          </w:p>
+        </w:tc>
+      </w:tr>
+      <w:tr>
+        <w:tc>
+          <w:tcPr>
+            <w:tcW w:type="dxa" w:w="3230"/>
+            <w:tcBorders>
+              <w:top w:val="single" w:sz="4" w:space="0" w:color="CBCBCB"/>
+              <w:left w:val="single" w:sz="4" w:space="0" w:color="CBCBCB"/>
+              <w:bottom w:val="single" w:sz="4" w:space="0" w:color="CBCBCB"/>
+              <w:right w:val="single" w:sz="4" w:space="0" w:color="CBCBCB"/>
+            </w:tcBorders>
+          </w:tcPr>
+          <w:p>
+            <w:r>
+              <w:rPr>
+                <w:sz w:val="20"/>
+              </w:rPr>
+              <w:t>2026-07-26</w:t>
+            </w:r>
+          </w:p>
+        </w:tc>
+        <w:tc>
+          <w:tcPr>
+            <w:tcW w:type="dxa" w:w="3230"/>
+            <w:tcBorders>
+              <w:top w:val="single" w:sz="4" w:space="0" w:color="CBCBCB"/>
+              <w:left w:val="single" w:sz="4" w:space="0" w:color="CBCBCB"/>
+              <w:bottom w:val="single" w:sz="4" w:space="0" w:color="CBCBCB"/>
+              <w:right w:val="single" w:sz="4" w:space="0" w:color="CBCBCB"/>
+            </w:tcBorders>
+          </w:tcPr>
+          <w:p>
+            <w:r>
+              <w:rPr>
+                <w:sz w:val="20"/>
+              </w:rPr>
               <w:t xml:space="preserve">Bước 2.1 ✅ — 15/16 ảnh nhóm Kết nối &amp; Quản lý thiết bị (verify từng ảnh bằng Read); 🛑 thiếu </w:t>
             </w:r>
             <w:r>
@@ -5278,7 +5370,6 @@
         <w:tc>
           <w:tcPr>
             <w:tcW w:type="dxa" w:w="3230"/>
-            <w:shd w:val="clear" w:color="auto" w:fill="B8B3D6"/>
             <w:tcBorders>
               <w:top w:val="single" w:sz="4" w:space="0" w:color="CBCBCB"/>
               <w:left w:val="single" w:sz="4" w:space="0" w:color="CBCBCB"/>

</xml_diff>

<commit_message>
[user-manual-ccu-zcu] Bước 2.2: Hoàn tất screenshot nhóm Remote & Điều khiển (ZCU online)
- Chụp 27/28 ảnh nhóm 2.2 (RemoteScreen 9, MultiRemote 4, FileManager 7, ConfirmDelete 2, RemoteCommand 5) + 2/2 ảnh bù 2.1 (network-scan-results, connection-entry-default P01 online), verify từng ảnh bằng Read tool
- Chỉ thiếu system-inventory-data: agent ZCU (build 07-24) cũ hơn commit SysInfo (07-25) → chuyển bù ở bước 2.3 sau khi deploy lại agent
- Tạo dữ liệu demo qua SSH: /home/kztek/kztek-demo/ + demo-upload.txt; gỡ blocker ZCU offline
- Ghi nhận 3 lỗi chức năng phát hiện khi thao tác: F01 record tự dừng (P2), F02 SysInfo/Privacy/Chat/Clipboard fail âm thầm với agent cũ (P2), F03 snippet dropdown không mở (P3)
- Cập nhật STEP-2.2 (status done) + PLAN-MASTER (2.2 ✅, gỡ blocker); xuất DOCX (PDF fail do docx2pdf RPC)

Plan: docs/plans/PLAN-user-manual-ccu-zcu-2026-07-26/steps/STEP-2.2-shots-remote.md
Co-Authored-By: Claude Opus 5 (1M context) <noreply@anthropic.com>
</commit_message>
<xml_diff>
--- a/docs/plans/PLAN-user-manual-ccu-zcu-2026-07-26/PLAN-MASTER.docx
+++ b/docs/plans/PLAN-user-manual-ccu-zcu-2026-07-26/PLAN-MASTER.docx
@@ -40,7 +40,7 @@
         <w:rPr>
           <w:sz w:val="21"/>
         </w:rPr>
-        <w:t>updated: 2026-07-26 18:18</w:t>
+        <w:t>updated: 2026-07-26 19:10</w:t>
       </w:r>
     </w:p>
     <w:p>
@@ -1807,7 +1807,7 @@
               <w:rPr>
                 <w:sz w:val="20"/>
               </w:rPr>
-              <w:t>🛑</w:t>
+              <w:t>✅</w:t>
             </w:r>
           </w:p>
         </w:tc>
@@ -1847,7 +1847,7 @@
               <w:rPr>
                 <w:sz w:val="20"/>
               </w:rPr>
-              <w:t>- (4/28 ảnh — chờ ZCU online)</w:t>
+              <w:t>2026-07-26 19:10 (27/28 — chỉ thiếu system-inventory do agent cũ)</w:t>
             </w:r>
           </w:p>
         </w:tc>
@@ -3593,6 +3593,46 @@
         <w:rPr>
           <w:sz w:val="21"/>
         </w:rPr>
+        <w:t xml:space="preserve">✅ </w:t>
+      </w:r>
+      <w:r>
+        <w:rPr>
+          <w:b/>
+          <w:sz w:val="21"/>
+        </w:rPr>
+        <w:t>[GỠ 2026-07-26 19:10] Blocker ZCU offline đã HẾT</w:t>
+      </w:r>
+      <w:r>
+        <w:rPr>
+          <w:sz w:val="21"/>
+        </w:rPr>
+        <w:t xml:space="preserve"> — VM </w:t>
+      </w:r>
+      <w:r>
+        <w:rPr>
+          <w:rFonts w:ascii="Courier New" w:hAnsi="Courier New"/>
+          <w:color w:val="F05922"/>
+          <w:sz w:val="21"/>
+        </w:rPr>
+        <w:t>192.168.1.4</w:t>
+      </w:r>
+      <w:r>
+        <w:rPr>
+          <w:sz w:val="21"/>
+        </w:rPr>
+        <w:t xml:space="preserve"> online (22 + 17600 mở). Bước 2.2 hoàn tất 27/28 ảnh + 2/2 ảnh bù 2.1.</w:t>
+      </w:r>
+    </w:p>
+    <w:p>
+      <w:pPr>
+        <w:pStyle w:val="ListBullet"/>
+        <w:spacing w:after="20"/>
+        <w:ind w:left="283"/>
+      </w:pPr>
+      <w:r>
+        <w:rPr>
+          <w:sz w:val="21"/>
+        </w:rPr>
         <w:t xml:space="preserve">🛑 </w:t>
       </w:r>
       <w:r>
@@ -3600,39 +3640,13 @@
           <w:b/>
           <w:sz w:val="21"/>
         </w:rPr>
-        <w:t>[Hiện trạng sau 4.1 — 2026-07-26 18:18] VM ZCU `192.168.1.4` OFFLINE → Phase 2 còn dở:</w:t>
+        <w:t>[Blocker mới — nhỏ, chuyển bước 2.3] Agent ZCU cũ hơn client:</w:t>
       </w:r>
       <w:r>
         <w:rPr>
           <w:sz w:val="21"/>
         </w:rPr>
-        <w:t xml:space="preserve"> bước 2.2 mới có 4/28 ảnh (+2 ảnh bù 2.1 chưa chụp), bước 2.3 và 2.4 HOÃN toàn bộ. Tổng 61 ảnh chờ chụp (đã liệt kê tại Phụ lục A của MANUAL). Bản DOCX/PDF vừa xuất là </w:t>
-      </w:r>
-      <w:r>
-        <w:rPr>
-          <w:b/>
-          <w:sz w:val="21"/>
-        </w:rPr>
-        <w:t>BẢN NHÁP</w:t>
-      </w:r>
-      <w:r>
-        <w:rPr>
-          <w:sz w:val="21"/>
-        </w:rPr>
-        <w:t xml:space="preserve"> — chưa đạt DoD đầy đủ WF-DOCS. </w:t>
-      </w:r>
-      <w:r>
-        <w:rPr>
-          <w:b/>
-          <w:sz w:val="21"/>
-        </w:rPr>
-        <w:t>Cần user:</w:t>
-      </w:r>
-      <w:r>
-        <w:rPr>
-          <w:sz w:val="21"/>
-        </w:rPr>
-        <w:t xml:space="preserve"> sửa VM (nghi NAT thay vì Bridged / VM treo — kiểm tra </w:t>
+        <w:t xml:space="preserve"> agent đang chạy (build 2026-07-24, </w:t>
       </w:r>
       <w:r>
         <w:rPr>
@@ -3640,13 +3654,108 @@
           <w:color w:val="F05922"/>
           <w:sz w:val="21"/>
         </w:rPr>
-        <w:t>ip a</w:t>
+        <w:t>/home/kztek/ipgs/remote-agent</w:t>
       </w:r>
       <w:r>
         <w:rPr>
           <w:sz w:val="21"/>
         </w:rPr>
-        <w:t xml:space="preserve">, cổng 22/17600) rồi yêu cầu chạy tiếp 2.2 → 2.3 → 2.4 → thay 61 marker → khôi phục profile store từ </w:t>
+        <w:t>) CŨ hơn commit thêm SysInfo/Chat/Privacy/Clipboard (</w:t>
+      </w:r>
+      <w:r>
+        <w:rPr>
+          <w:rFonts w:ascii="Courier New" w:hAnsi="Courier New"/>
+          <w:color w:val="F05922"/>
+          <w:sz w:val="21"/>
+        </w:rPr>
+        <w:t>52e93ae</w:t>
+      </w:r>
+      <w:r>
+        <w:rPr>
+          <w:sz w:val="21"/>
+        </w:rPr>
+        <w:t xml:space="preserve">, 2026-07-25). Hệ quả: </w:t>
+      </w:r>
+      <w:r>
+        <w:rPr>
+          <w:rFonts w:ascii="Courier New" w:hAnsi="Courier New"/>
+          <w:color w:val="F05922"/>
+          <w:sz w:val="21"/>
+        </w:rPr>
+        <w:t>system-inventory-data.png</w:t>
+      </w:r>
+      <w:r>
+        <w:rPr>
+          <w:sz w:val="21"/>
+        </w:rPr>
+        <w:t xml:space="preserve"> (1 ảnh cuối của nhóm 2.2) KHÔNG chụp được, và Privacy/Chat/Clipboard không hoạt động thật. </w:t>
+      </w:r>
+      <w:r>
+        <w:rPr>
+          <w:b/>
+          <w:sz w:val="21"/>
+        </w:rPr>
+        <w:t>Cần bước 2.3 deploy lại agent bản mới (đã được user cho phép chạy ZcuSetupWizard cài thật)</w:t>
+      </w:r>
+      <w:r>
+        <w:rPr>
+          <w:sz w:val="21"/>
+        </w:rPr>
+        <w:t xml:space="preserve"> rồi mới chụp bù </w:t>
+      </w:r>
+      <w:r>
+        <w:rPr>
+          <w:rFonts w:ascii="Courier New" w:hAnsi="Courier New"/>
+          <w:color w:val="F05922"/>
+          <w:sz w:val="21"/>
+        </w:rPr>
+        <w:t>system-inventory-data</w:t>
+      </w:r>
+      <w:r>
+        <w:rPr>
+          <w:sz w:val="21"/>
+        </w:rPr>
+        <w:t xml:space="preserve">. Ghi nhận F02 trong </w:t>
+      </w:r>
+      <w:r>
+        <w:rPr>
+          <w:rFonts w:ascii="Courier New" w:hAnsi="Courier New"/>
+          <w:color w:val="F05922"/>
+          <w:sz w:val="21"/>
+        </w:rPr>
+        <w:t>docs/bugs/BUG-ccu-ui-findings-2026-07-26.md</w:t>
+      </w:r>
+      <w:r>
+        <w:rPr>
+          <w:sz w:val="21"/>
+        </w:rPr>
+        <w:t>.</w:t>
+      </w:r>
+    </w:p>
+    <w:p>
+      <w:pPr>
+        <w:pStyle w:val="ListBullet"/>
+        <w:spacing w:after="20"/>
+        <w:ind w:left="283"/>
+      </w:pPr>
+      <w:r>
+        <w:rPr>
+          <w:sz w:val="21"/>
+        </w:rPr>
+        <w:t xml:space="preserve">ℹ️ </w:t>
+      </w:r>
+      <w:r>
+        <w:rPr>
+          <w:b/>
+          <w:sz w:val="21"/>
+        </w:rPr>
+        <w:t>Còn lại của Phase 2:</w:t>
+      </w:r>
+      <w:r>
+        <w:rPr>
+          <w:sz w:val="21"/>
+        </w:rPr>
+        <w:t xml:space="preserve"> bước 2.3, 2.4 vẫn ⏭️ HOÃN theo quyết định user (viết tài liệu trước). Sau khi xong 2.3/2.4 → thay marker ⏳ trong MANUAL → khôi phục profile store từ </w:t>
       </w:r>
       <w:r>
         <w:rPr>
@@ -5387,6 +5496,123 @@
           </w:p>
         </w:tc>
       </w:tr>
+      <w:tr>
+        <w:tc>
+          <w:tcPr>
+            <w:tcW w:type="dxa" w:w="3230"/>
+            <w:shd w:val="clear" w:color="auto" w:fill="B8B3D6"/>
+            <w:tcBorders>
+              <w:top w:val="single" w:sz="4" w:space="0" w:color="CBCBCB"/>
+              <w:left w:val="single" w:sz="4" w:space="0" w:color="CBCBCB"/>
+              <w:bottom w:val="single" w:sz="4" w:space="0" w:color="CBCBCB"/>
+              <w:right w:val="single" w:sz="4" w:space="0" w:color="CBCBCB"/>
+            </w:tcBorders>
+          </w:tcPr>
+          <w:p>
+            <w:r>
+              <w:rPr>
+                <w:sz w:val="20"/>
+              </w:rPr>
+              <w:t>2026-07-26</w:t>
+            </w:r>
+          </w:p>
+        </w:tc>
+        <w:tc>
+          <w:tcPr>
+            <w:tcW w:type="dxa" w:w="3230"/>
+            <w:shd w:val="clear" w:color="auto" w:fill="B8B3D6"/>
+            <w:tcBorders>
+              <w:top w:val="single" w:sz="4" w:space="0" w:color="CBCBCB"/>
+              <w:left w:val="single" w:sz="4" w:space="0" w:color="CBCBCB"/>
+              <w:bottom w:val="single" w:sz="4" w:space="0" w:color="CBCBCB"/>
+              <w:right w:val="single" w:sz="4" w:space="0" w:color="CBCBCB"/>
+            </w:tcBorders>
+          </w:tcPr>
+          <w:p>
+            <w:r>
+              <w:rPr>
+                <w:sz w:val="20"/>
+              </w:rPr>
+              <w:t xml:space="preserve">Bước 2.2 ✅ (ZCU online) — hoàn tất 27/28 ảnh nhóm 2.2 + 2/2 ảnh bù 2.1 (verify từng ảnh bằng Read); chỉ thiếu </w:t>
+            </w:r>
+            <w:r>
+              <w:rPr>
+                <w:rFonts w:ascii="Courier New" w:hAnsi="Courier New"/>
+                <w:color w:val="F05922"/>
+                <w:sz w:val="20"/>
+              </w:rPr>
+              <w:t>system-inventory-data</w:t>
+            </w:r>
+            <w:r>
+              <w:rPr>
+                <w:sz w:val="20"/>
+              </w:rPr>
+              <w:t xml:space="preserve"> do agent ZCU cũ (build 07-24 &lt; feature SysInfo 07-25) → chuyển sang bù ở bước 2.3 sau khi deploy lại agent; tạo dữ liệu demo SSH </w:t>
+            </w:r>
+            <w:r>
+              <w:rPr>
+                <w:rFonts w:ascii="Courier New" w:hAnsi="Courier New"/>
+                <w:color w:val="F05922"/>
+                <w:sz w:val="20"/>
+              </w:rPr>
+              <w:t>/home/kztek/kztek-demo/</w:t>
+            </w:r>
+            <w:r>
+              <w:rPr>
+                <w:sz w:val="20"/>
+              </w:rPr>
+              <w:t xml:space="preserve">; gỡ blocker ZCU offline. </w:t>
+            </w:r>
+            <w:r>
+              <w:rPr>
+                <w:b/>
+                <w:sz w:val="20"/>
+              </w:rPr>
+              <w:t>Kiểm thử phát hiện 3 lỗi</w:t>
+            </w:r>
+            <w:r>
+              <w:rPr>
+                <w:sz w:val="20"/>
+              </w:rPr>
+              <w:t xml:space="preserve"> → </w:t>
+            </w:r>
+            <w:r>
+              <w:rPr>
+                <w:rFonts w:ascii="Courier New" w:hAnsi="Courier New"/>
+                <w:color w:val="F05922"/>
+                <w:sz w:val="20"/>
+              </w:rPr>
+              <w:t>docs/bugs/BUG-ccu-ui-findings-2026-07-26.md</w:t>
+            </w:r>
+            <w:r>
+              <w:rPr>
+                <w:sz w:val="20"/>
+              </w:rPr>
+              <w:t>: F01 (record tự dừng "độ phân giải thay đổi", P2), F02 (SysInfo/Privacy/Chat/Clipboard fail âm thầm với agent cũ, P2), F03 (snippet dropdown không mở, P3)</w:t>
+            </w:r>
+          </w:p>
+        </w:tc>
+        <w:tc>
+          <w:tcPr>
+            <w:tcW w:type="dxa" w:w="3230"/>
+            <w:shd w:val="clear" w:color="auto" w:fill="B8B3D6"/>
+            <w:tcBorders>
+              <w:top w:val="single" w:sz="4" w:space="0" w:color="CBCBCB"/>
+              <w:left w:val="single" w:sz="4" w:space="0" w:color="CBCBCB"/>
+              <w:bottom w:val="single" w:sz="4" w:space="0" w:color="CBCBCB"/>
+              <w:right w:val="single" w:sz="4" w:space="0" w:color="CBCBCB"/>
+            </w:tcBorders>
+          </w:tcPr>
+          <w:p>
+            <w:r>
+              <w:rPr>
+                <w:sz w:val="20"/>
+              </w:rPr>
+              <w:t>documentation-writer</w:t>
+            </w:r>
+          </w:p>
+        </w:tc>
+      </w:tr>
     </w:tbl>
     <w:p/>
     <w:p>

</xml_diff>

<commit_message>
[user-manual-ccu-zcu] Bước 4.1 (lần 2): Bản chính thức HDSD CCU/ZCU — thay đủ ảnh thật, xuất DOCX/PDF
- Thay 57 marker CHỜ ẢNH bằng ảnh thật (Read từng ảnh, caption đúng nội dung); 4 marker destructive thay bằng mô tả chữ (Phụ lục A)
- Đánh số Hình 1–75 liên tục; verify 75 link = 75 caption = 75 PNG, 0 marker, 0 ảnh mồ côi
- Sửa nội dung theo thực tế: ch12.6 ufw inactive + khuyến nghị bật tường lửa (F06), lưu ý loginctl (11.2), ssh-copy-id trên Windows (13.1), các thông báo lỗi đúng UI thật
- Bỏ nhãn BẢN NHÁP → v1.0 chính thức; Phụ lục A đổi thành ghi chú 4 thao tác không kèm ảnh
- Khôi phục profile store thật từ temp backup, verify 4 máy (Kiosk/Kien/VietAnh-VM/ZCU)
- Xuất DOCX 4,95 MB (75 ảnh nhúng) + PDF 5,1 MB; PLAN-MASTER đóng plan (status: done), việc còn lại F01–F06 chuyển WF-BUGFIX

Plan: docs/plans/PLAN-user-manual-ccu-zcu-2026-07-26/steps/STEP-4.1-export-verify.md
Co-Authored-By: Claude Opus 5 (1M context) <noreply@anthropic.com>
</commit_message>
<xml_diff>
--- a/docs/plans/PLAN-user-manual-ccu-zcu-2026-07-26/PLAN-MASTER.docx
+++ b/docs/plans/PLAN-user-manual-ccu-zcu-2026-07-26/PLAN-MASTER.docx
@@ -40,7 +40,7 @@
         <w:rPr>
           <w:sz w:val="21"/>
         </w:rPr>
-        <w:t>updated: 2026-07-26 21:28</w:t>
+        <w:t>updated: 2026-07-26 21:52</w:t>
       </w:r>
     </w:p>
     <w:p>
@@ -51,7 +51,7 @@
         <w:rPr>
           <w:sz w:val="21"/>
         </w:rPr>
-        <w:t>status: in-progress</w:t>
+        <w:t>status: done</w:t>
       </w:r>
     </w:p>
     <w:p>
@@ -3387,7 +3387,7 @@
               <w:rPr>
                 <w:sz w:val="20"/>
               </w:rPr>
-              <w:t>2026-07-26 18:18 (BẢN NHÁP — chạy lại sau khi đủ ảnh)</w:t>
+              <w:t>2026-07-26 21:52 (lần 2 — BẢN CHÍNH THỨC v1.0, 75 ảnh; lần 1 nháp 18:18)</w:t>
             </w:r>
           </w:p>
         </w:tc>
@@ -3431,7 +3431,7 @@
         <w:rPr>
           <w:sz w:val="21"/>
         </w:rPr>
-        <w:t xml:space="preserve"> — ✅ BẢN NHÁP (19 ảnh thật, 61 marker ⏳)</w:t>
+        <w:t xml:space="preserve"> — ✅ BẢN CHÍNH THỨC v1.0 (75 hình thật, 0 marker)</w:t>
       </w:r>
     </w:p>
     <w:p>
@@ -3458,7 +3458,7 @@
         <w:rPr>
           <w:sz w:val="21"/>
         </w:rPr>
-        <w:t xml:space="preserve"> — ✅ BẢN NHÁP (967 KB, 20 ảnh nhúng)</w:t>
+        <w:t xml:space="preserve"> — ✅ 4,95 MB, 75 ảnh nhúng</w:t>
       </w:r>
     </w:p>
     <w:p>
@@ -3485,7 +3485,7 @@
         <w:rPr>
           <w:sz w:val="21"/>
         </w:rPr>
-        <w:t xml:space="preserve"> — ✅ BẢN NHÁP (1,7 MB)</w:t>
+        <w:t xml:space="preserve"> — ✅ 5,1 MB</w:t>
       </w:r>
     </w:p>
     <w:p>
@@ -3498,7 +3498,7 @@
         <w:rPr>
           <w:sz w:val="21"/>
         </w:rPr>
-        <w:t xml:space="preserve">[ ] </w:t>
+        <w:t xml:space="preserve">[x] </w:t>
       </w:r>
       <w:r>
         <w:rPr>
@@ -3512,7 +3512,7 @@
         <w:rPr>
           <w:sz w:val="21"/>
         </w:rPr>
-        <w:t xml:space="preserve"> (đủ 100% màn hình theo Screen Inventory bước 0.2) — hiện 19/80, còn 61 chờ VM ZCU</w:t>
+        <w:t xml:space="preserve"> — ✅ 75 file, đủ 18/18 màn hình theo Screen Inventory (4 thao tác destructive mô tả bằng chữ theo lệnh cấm user — Phụ lục A)</w:t>
       </w:r>
     </w:p>
     <w:p>
@@ -3849,83 +3849,20 @@
         <w:rPr>
           <w:sz w:val="21"/>
         </w:rPr>
-        <w:t xml:space="preserve">ℹ️ </w:t>
+        <w:t xml:space="preserve">✅ </w:t>
       </w:r>
       <w:r>
         <w:rPr>
           <w:b/>
           <w:sz w:val="21"/>
         </w:rPr>
-        <w:t>4 marker MANUAL còn thiếu ảnh (bước thay-marker thay bằng MÔ TẢ CHỮ, không có ảnh):</w:t>
+        <w:t>[HOÀN TẤT 2026-07-26 21:52 — 4.1 lần 2] Plan KHÔNG còn blocker.</w:t>
       </w:r>
       <w:r>
         <w:rPr>
           <w:sz w:val="21"/>
         </w:rPr>
-        <w:t xml:space="preserve"> </w:t>
-      </w:r>
-      <w:r>
-        <w:rPr>
-          <w:rFonts w:ascii="Courier New" w:hAnsi="Courier New"/>
-          <w:color w:val="F05922"/>
-          <w:sz w:val="21"/>
-        </w:rPr>
-        <w:t>zcu-terminal-setup-script</w:t>
-      </w:r>
-      <w:r>
-        <w:rPr>
-          <w:sz w:val="21"/>
-        </w:rPr>
-        <w:t xml:space="preserve"> (2.4 — BLOCK: chạy lại setup ghi đè agent, ngoài scope đọc), </w:t>
-      </w:r>
-      <w:r>
-        <w:rPr>
-          <w:rFonts w:ascii="Courier New" w:hAnsi="Courier New"/>
-          <w:color w:val="F05922"/>
-          <w:sz w:val="21"/>
-        </w:rPr>
-        <w:t>kiosk-deploy-log</w:t>
-      </w:r>
-      <w:r>
-        <w:rPr>
-          <w:sz w:val="21"/>
-        </w:rPr>
-        <w:t xml:space="preserve">, </w:t>
-      </w:r>
-      <w:r>
-        <w:rPr>
-          <w:rFonts w:ascii="Courier New" w:hAnsi="Courier New"/>
-          <w:color w:val="F05922"/>
-          <w:sz w:val="21"/>
-        </w:rPr>
-        <w:t>kiosk-deploy-error</w:t>
-      </w:r>
-      <w:r>
-        <w:rPr>
-          <w:sz w:val="21"/>
-        </w:rPr>
-        <w:t xml:space="preserve">, </w:t>
-      </w:r>
-      <w:r>
-        <w:rPr>
-          <w:rFonts w:ascii="Courier New" w:hAnsi="Courier New"/>
-          <w:color w:val="F05922"/>
-          <w:sz w:val="21"/>
-        </w:rPr>
-        <w:t>remote-app-install-output</w:t>
-      </w:r>
-      <w:r>
-        <w:rPr>
-          <w:sz w:val="21"/>
-        </w:rPr>
-        <w:t xml:space="preserve"> (2.3 — BLOCK vĩnh viễn theo lệnh cấm user, destructive). </w:t>
-      </w:r>
-      <w:r>
-        <w:rPr>
-          <w:b/>
-          <w:sz w:val="21"/>
-        </w:rPr>
-        <w:t>57/61 marker đã có file khớp.</w:t>
+        <w:t xml:space="preserve"> 57 marker đã thay bằng ảnh thật (Hình 1–75 liên tục), 4 marker destructive thay bằng mô tả chữ (ghi Phụ lục A của MANUAL); ch12.6 ufw đã viết lại theo thực tế inactive + khuyến nghị bật (gắn F06); profile store thật đã khôi phục và verify 4 máy; DOCX/PDF chính thức đã xuất.</w:t>
       </w:r>
     </w:p>
     <w:p>
@@ -3945,13 +3882,13 @@
           <w:b/>
           <w:sz w:val="21"/>
         </w:rPr>
-        <w:t>Việc còn lại (Phase 3+):</w:t>
+        <w:t>Việc còn lại NGOÀI plan này:</w:t>
       </w:r>
       <w:r>
         <w:rPr>
           <w:sz w:val="21"/>
         </w:rPr>
-        <w:t xml:space="preserve"> thay marker ⏳ trong MANUAL (lưu ý ch12.6 ufw: thiết bị thật INACTIVE, chỉnh câu chữ hoặc gắn F06) → khôi phục profile store từ </w:t>
+        <w:t xml:space="preserve"> 6 finding F01–F06 trong </w:t>
       </w:r>
       <w:r>
         <w:rPr>
@@ -3959,13 +3896,13 @@
           <w:color w:val="F05922"/>
           <w:sz w:val="21"/>
         </w:rPr>
-        <w:t>temp/user-manual-ccu-zcu/profiles.backup.json</w:t>
+        <w:t>docs/bugs/BUG-ccu-ui-findings-2026-07-26.md</w:t>
       </w:r>
       <w:r>
         <w:rPr>
           <w:sz w:val="21"/>
         </w:rPr>
-        <w:t xml:space="preserve"> → xuất lại DOCX/PDF (chạy lại 4.1).</w:t>
+        <w:t xml:space="preserve"> chuyển senior-developer xử lý theo WF-BUGFIX (F01/F02/F06 P2; F03/F04/F05 P3).</w:t>
       </w:r>
     </w:p>
     <w:p>
@@ -6021,6 +5958,93 @@
               <w:rPr>
                 <w:sz w:val="20"/>
               </w:rPr>
+              <w:t xml:space="preserve">Bước 4.1 ✅ lần 2 — </w:t>
+            </w:r>
+            <w:r>
+              <w:rPr>
+                <w:b/>
+                <w:sz w:val="20"/>
+              </w:rPr>
+              <w:t>BẢN CHÍNH THỨC v1.0, PLAN ĐÓNG (status: done).</w:t>
+            </w:r>
+            <w:r>
+              <w:rPr>
+                <w:sz w:val="20"/>
+              </w:rPr>
+              <w:t xml:space="preserve"> Thay 57 marker bằng ảnh thật (Read từng ảnh viết caption đúng thực tế), 4 marker destructive → mô tả chữ; đánh số Hình 1–75 liên tục (verify 75 </w:t>
+            </w:r>
+            <w:r>
+              <w:rPr>
+                <w:rFonts w:ascii="Courier New" w:hAnsi="Courier New"/>
+                <w:color w:val="F05922"/>
+                <w:sz w:val="20"/>
+              </w:rPr>
+              <w:t>![]()</w:t>
+            </w:r>
+            <w:r>
+              <w:rPr>
+                <w:sz w:val="20"/>
+              </w:rPr>
+              <w:t xml:space="preserve"> = 75 caption = 75 PNG, 0 marker, 0 mồ côi); sửa ch12.6 ufw inactive + khuyến nghị bật (F06), bổ sung lưu ý loginctl (11.2) + ssh-copy-id Windows (13.1); bỏ nhãn nháp, Phụ lục A → ghi chú 4 thao tác không ảnh; khôi phục profile store thật (4 máy verify); xuất DOCX 4,95 MB (75 ảnh nhúng) + PDF 5,1 MB. Việc còn lại F01–F06 → WF-BUGFIX</w:t>
+            </w:r>
+          </w:p>
+        </w:tc>
+        <w:tc>
+          <w:tcPr>
+            <w:tcW w:type="dxa" w:w="3230"/>
+            <w:shd w:val="clear" w:color="auto" w:fill="B8B3D6"/>
+            <w:tcBorders>
+              <w:top w:val="single" w:sz="4" w:space="0" w:color="CBCBCB"/>
+              <w:left w:val="single" w:sz="4" w:space="0" w:color="CBCBCB"/>
+              <w:bottom w:val="single" w:sz="4" w:space="0" w:color="CBCBCB"/>
+              <w:right w:val="single" w:sz="4" w:space="0" w:color="CBCBCB"/>
+            </w:tcBorders>
+          </w:tcPr>
+          <w:p>
+            <w:r>
+              <w:rPr>
+                <w:sz w:val="20"/>
+              </w:rPr>
+              <w:t>documentation-writer</w:t>
+            </w:r>
+          </w:p>
+        </w:tc>
+      </w:tr>
+      <w:tr>
+        <w:tc>
+          <w:tcPr>
+            <w:tcW w:type="dxa" w:w="3230"/>
+            <w:tcBorders>
+              <w:top w:val="single" w:sz="4" w:space="0" w:color="CBCBCB"/>
+              <w:left w:val="single" w:sz="4" w:space="0" w:color="CBCBCB"/>
+              <w:bottom w:val="single" w:sz="4" w:space="0" w:color="CBCBCB"/>
+              <w:right w:val="single" w:sz="4" w:space="0" w:color="CBCBCB"/>
+            </w:tcBorders>
+          </w:tcPr>
+          <w:p>
+            <w:r>
+              <w:rPr>
+                <w:sz w:val="20"/>
+              </w:rPr>
+              <w:t>2026-07-26</w:t>
+            </w:r>
+          </w:p>
+        </w:tc>
+        <w:tc>
+          <w:tcPr>
+            <w:tcW w:type="dxa" w:w="3230"/>
+            <w:tcBorders>
+              <w:top w:val="single" w:sz="4" w:space="0" w:color="CBCBCB"/>
+              <w:left w:val="single" w:sz="4" w:space="0" w:color="CBCBCB"/>
+              <w:bottom w:val="single" w:sz="4" w:space="0" w:color="CBCBCB"/>
+              <w:right w:val="single" w:sz="4" w:space="0" w:color="CBCBCB"/>
+            </w:tcBorders>
+          </w:tcPr>
+          <w:p>
+            <w:r>
+              <w:rPr>
+                <w:sz w:val="20"/>
+              </w:rPr>
               <w:t xml:space="preserve">Bước 2.4 ✅ — </w:t>
             </w:r>
             <w:r>
@@ -6109,7 +6133,6 @@
         <w:tc>
           <w:tcPr>
             <w:tcW w:type="dxa" w:w="3230"/>
-            <w:shd w:val="clear" w:color="auto" w:fill="B8B3D6"/>
             <w:tcBorders>
               <w:top w:val="single" w:sz="4" w:space="0" w:color="CBCBCB"/>
               <w:left w:val="single" w:sz="4" w:space="0" w:color="CBCBCB"/>

</xml_diff>